<commit_message>
Add email template and TD notes to English revision sheet
Co-Authored-By: Claude Opus 5.5 <noreply@anthropic.com>
Claude-Session: https://claude.ai/code/session_01SxCGvMisV1WyaExPLPSBu2
</commit_message>
<xml_diff>
--- a/Fiche_reflexes_anglais.docx
+++ b/Fiche_reflexes_anglais.docx
@@ -591,6 +591,394 @@
     </w:p>
     <w:p>
       <w:pPr>
+        <w:pStyle w:val="Heading2"/>
+        <w:spacing w:after="100" w:before="200"/>
+      </w:pPr>
+      <w:r>
+        <w:rPr>
+          <w:color w:val="1F4E79"/>
+        </w:rPr>
+        <w:t xml:space="preserve">Les mots vus en TD (d'après tes notes)</w:t>
+      </w:r>
+    </w:p>
+    <w:tbl>
+      <w:tblPr>
+        <w:tblW w:type="dxa" w:w="9638"/>
+        <w:tblBorders>
+          <w:top w:val="single" w:color="auto" w:sz="4"/>
+          <w:left w:val="single" w:color="auto" w:sz="4"/>
+          <w:bottom w:val="single" w:color="auto" w:sz="4"/>
+          <w:right w:val="single" w:color="auto" w:sz="4"/>
+          <w:insideH w:val="single" w:color="auto" w:sz="4"/>
+          <w:insideV w:val="single" w:color="auto" w:sz="4"/>
+        </w:tblBorders>
+      </w:tblPr>
+      <w:tblGrid>
+        <w:gridCol w:w="2891"/>
+        <w:gridCol w:w="6747"/>
+      </w:tblGrid>
+      <w:tr>
+        <w:trPr>
+          <w:tblHeader/>
+        </w:trPr>
+        <w:tc>
+          <w:tcPr>
+            <w:tcW w:type="dxa" w:w="2891"/>
+            <w:shd w:fill="1F4E79" w:color="auto" w:val="clear"/>
+            <w:tcMar>
+              <w:top w:type="dxa" w:w="60"/>
+              <w:left w:type="dxa" w:w="100"/>
+              <w:bottom w:type="dxa" w:w="60"/>
+              <w:right w:type="dxa" w:w="100"/>
+            </w:tcMar>
+          </w:tcPr>
+          <w:p>
+            <w:r>
+              <w:rPr>
+                <w:b/>
+                <w:bCs/>
+                <w:color w:val="FFFFFF"/>
+              </w:rPr>
+              <w:t xml:space="preserve">Mot</w:t>
+            </w:r>
+          </w:p>
+        </w:tc>
+        <w:tc>
+          <w:tcPr>
+            <w:tcW w:type="dxa" w:w="6747"/>
+            <w:shd w:fill="1F4E79" w:color="auto" w:val="clear"/>
+            <w:tcMar>
+              <w:top w:type="dxa" w:w="60"/>
+              <w:left w:type="dxa" w:w="100"/>
+              <w:bottom w:type="dxa" w:w="60"/>
+              <w:right w:type="dxa" w:w="100"/>
+            </w:tcMar>
+          </w:tcPr>
+          <w:p>
+            <w:r>
+              <w:rPr>
+                <w:b/>
+                <w:bCs/>
+                <w:color w:val="FFFFFF"/>
+              </w:rPr>
+              <w:t xml:space="preserve">Définition modèle</w:t>
+            </w:r>
+          </w:p>
+        </w:tc>
+      </w:tr>
+      <w:tr>
+        <w:tc>
+          <w:tcPr>
+            <w:tcW w:type="dxa" w:w="2891"/>
+            <w:tcMar>
+              <w:top w:type="dxa" w:w="60"/>
+              <w:left w:type="dxa" w:w="100"/>
+              <w:bottom w:type="dxa" w:w="60"/>
+              <w:right w:type="dxa" w:w="100"/>
+            </w:tcMar>
+          </w:tcPr>
+          <w:p>
+            <w:r>
+              <w:rPr>
+                <w:b/>
+                <w:bCs/>
+              </w:rPr>
+              <w:t xml:space="preserve">applicant</w:t>
+            </w:r>
+            <w:r>
+              <w:t xml:space="preserve"> (= candidate)</w:t>
+            </w:r>
+          </w:p>
+        </w:tc>
+        <w:tc>
+          <w:tcPr>
+            <w:tcW w:type="dxa" w:w="6747"/>
+            <w:tcMar>
+              <w:top w:type="dxa" w:w="60"/>
+              <w:left w:type="dxa" w:w="100"/>
+              <w:bottom w:type="dxa" w:w="60"/>
+              <w:right w:type="dxa" w:w="100"/>
+            </w:tcMar>
+          </w:tcPr>
+          <w:p>
+            <w:r>
+              <w:t xml:space="preserve">a person who formally applies for a job or an internship.</w:t>
+            </w:r>
+          </w:p>
+        </w:tc>
+      </w:tr>
+      <w:tr>
+        <w:tc>
+          <w:tcPr>
+            <w:tcW w:type="dxa" w:w="2891"/>
+            <w:tcMar>
+              <w:top w:type="dxa" w:w="60"/>
+              <w:left w:type="dxa" w:w="100"/>
+              <w:bottom w:type="dxa" w:w="60"/>
+              <w:right w:type="dxa" w:w="100"/>
+            </w:tcMar>
+          </w:tcPr>
+          <w:p>
+            <w:r>
+              <w:rPr>
+                <w:b/>
+                <w:bCs/>
+              </w:rPr>
+              <w:t xml:space="preserve">work placement</w:t>
+            </w:r>
+            <w:r>
+              <w:t xml:space="preserve"> (= internship)</w:t>
+            </w:r>
+          </w:p>
+        </w:tc>
+        <w:tc>
+          <w:tcPr>
+            <w:tcW w:type="dxa" w:w="6747"/>
+            <w:tcMar>
+              <w:top w:type="dxa" w:w="60"/>
+              <w:left w:type="dxa" w:w="100"/>
+              <w:bottom w:type="dxa" w:w="60"/>
+              <w:right w:type="dxa" w:w="100"/>
+            </w:tcMar>
+          </w:tcPr>
+          <w:p>
+            <w:r>
+              <w:t xml:space="preserve">a temporary period of work in a company, usually for students, that allows them to gain professional experience.</w:t>
+            </w:r>
+          </w:p>
+        </w:tc>
+      </w:tr>
+      <w:tr>
+        <w:tc>
+          <w:tcPr>
+            <w:tcW w:type="dxa" w:w="2891"/>
+            <w:tcMar>
+              <w:top w:type="dxa" w:w="60"/>
+              <w:left w:type="dxa" w:w="100"/>
+              <w:bottom w:type="dxa" w:w="60"/>
+              <w:right w:type="dxa" w:w="100"/>
+            </w:tcMar>
+          </w:tcPr>
+          <w:p>
+            <w:r>
+              <w:rPr>
+                <w:b/>
+                <w:bCs/>
+              </w:rPr>
+              <w:t xml:space="preserve">to apply for</w:t>
+            </w:r>
+          </w:p>
+        </w:tc>
+        <w:tc>
+          <w:tcPr>
+            <w:tcW w:type="dxa" w:w="6747"/>
+            <w:tcMar>
+              <w:top w:type="dxa" w:w="60"/>
+              <w:left w:type="dxa" w:w="100"/>
+              <w:bottom w:type="dxa" w:w="60"/>
+              <w:right w:type="dxa" w:w="100"/>
+            </w:tcMar>
+          </w:tcPr>
+          <w:p>
+            <w:r>
+              <w:t xml:space="preserve">to make a formal request for a job, usually by sending a CV and a cover letter.</w:t>
+            </w:r>
+          </w:p>
+        </w:tc>
+      </w:tr>
+      <w:tr>
+        <w:tc>
+          <w:tcPr>
+            <w:tcW w:type="dxa" w:w="2891"/>
+            <w:tcMar>
+              <w:top w:type="dxa" w:w="60"/>
+              <w:left w:type="dxa" w:w="100"/>
+              <w:bottom w:type="dxa" w:w="60"/>
+              <w:right w:type="dxa" w:w="100"/>
+            </w:tcMar>
+          </w:tcPr>
+          <w:p>
+            <w:r>
+              <w:rPr>
+                <w:b/>
+                <w:bCs/>
+              </w:rPr>
+              <w:t xml:space="preserve">to advertise</w:t>
+            </w:r>
+          </w:p>
+        </w:tc>
+        <w:tc>
+          <w:tcPr>
+            <w:tcW w:type="dxa" w:w="6747"/>
+            <w:tcMar>
+              <w:top w:type="dxa" w:w="60"/>
+              <w:left w:type="dxa" w:w="100"/>
+              <w:bottom w:type="dxa" w:w="60"/>
+              <w:right w:type="dxa" w:w="100"/>
+            </w:tcMar>
+          </w:tcPr>
+          <w:p>
+            <w:r>
+              <w:t xml:space="preserve">to make a job vacancy known to the public, for example in a newspaper or on a website.</w:t>
+            </w:r>
+          </w:p>
+        </w:tc>
+      </w:tr>
+      <w:tr>
+        <w:tc>
+          <w:tcPr>
+            <w:tcW w:type="dxa" w:w="2891"/>
+            <w:tcMar>
+              <w:top w:type="dxa" w:w="60"/>
+              <w:left w:type="dxa" w:w="100"/>
+              <w:bottom w:type="dxa" w:w="60"/>
+              <w:right w:type="dxa" w:w="100"/>
+            </w:tcMar>
+          </w:tcPr>
+          <w:p>
+            <w:r>
+              <w:rPr>
+                <w:b/>
+                <w:bCs/>
+              </w:rPr>
+              <w:t xml:space="preserve">employed</w:t>
+            </w:r>
+          </w:p>
+        </w:tc>
+        <w:tc>
+          <w:tcPr>
+            <w:tcW w:type="dxa" w:w="6747"/>
+            <w:tcMar>
+              <w:top w:type="dxa" w:w="60"/>
+              <w:left w:type="dxa" w:w="100"/>
+              <w:bottom w:type="dxa" w:w="60"/>
+              <w:right w:type="dxa" w:w="100"/>
+            </w:tcMar>
+          </w:tcPr>
+          <w:p>
+            <w:r>
+              <w:t xml:space="preserve">describes a person who has a paid job and works for a company or an organisation.</w:t>
+            </w:r>
+          </w:p>
+        </w:tc>
+      </w:tr>
+      <w:tr>
+        <w:tc>
+          <w:tcPr>
+            <w:tcW w:type="dxa" w:w="2891"/>
+            <w:tcMar>
+              <w:top w:type="dxa" w:w="60"/>
+              <w:left w:type="dxa" w:w="100"/>
+              <w:bottom w:type="dxa" w:w="60"/>
+              <w:right w:type="dxa" w:w="100"/>
+            </w:tcMar>
+          </w:tcPr>
+          <w:p>
+            <w:r>
+              <w:rPr>
+                <w:b/>
+                <w:bCs/>
+              </w:rPr>
+              <w:t xml:space="preserve">enclosed</w:t>
+            </w:r>
+          </w:p>
+        </w:tc>
+        <w:tc>
+          <w:tcPr>
+            <w:tcW w:type="dxa" w:w="6747"/>
+            <w:tcMar>
+              <w:top w:type="dxa" w:w="60"/>
+              <w:left w:type="dxa" w:w="100"/>
+              <w:bottom w:type="dxa" w:w="60"/>
+              <w:right w:type="dxa" w:w="100"/>
+            </w:tcMar>
+          </w:tcPr>
+          <w:p>
+            <w:r>
+              <w:t xml:space="preserve">describes a document that is sent with a letter or an email, such as a CV.</w:t>
+            </w:r>
+          </w:p>
+        </w:tc>
+      </w:tr>
+      <w:tr>
+        <w:tc>
+          <w:tcPr>
+            <w:tcW w:type="dxa" w:w="2891"/>
+            <w:tcMar>
+              <w:top w:type="dxa" w:w="60"/>
+              <w:left w:type="dxa" w:w="100"/>
+              <w:bottom w:type="dxa" w:w="60"/>
+              <w:right w:type="dxa" w:w="100"/>
+            </w:tcMar>
+          </w:tcPr>
+          <w:p>
+            <w:r>
+              <w:rPr>
+                <w:b/>
+                <w:bCs/>
+              </w:rPr>
+              <w:t xml:space="preserve">to match</w:t>
+            </w:r>
+          </w:p>
+        </w:tc>
+        <w:tc>
+          <w:tcPr>
+            <w:tcW w:type="dxa" w:w="6747"/>
+            <w:tcMar>
+              <w:top w:type="dxa" w:w="60"/>
+              <w:left w:type="dxa" w:w="100"/>
+              <w:bottom w:type="dxa" w:w="60"/>
+              <w:right w:type="dxa" w:w="100"/>
+            </w:tcMar>
+          </w:tcPr>
+          <w:p>
+            <w:r>
+              <w:t xml:space="preserve">to correspond to something; for example, a profile matches a job when it has the skills required.</w:t>
+            </w:r>
+          </w:p>
+        </w:tc>
+      </w:tr>
+      <w:tr>
+        <w:tc>
+          <w:tcPr>
+            <w:tcW w:type="dxa" w:w="2891"/>
+            <w:tcMar>
+              <w:top w:type="dxa" w:w="60"/>
+              <w:left w:type="dxa" w:w="100"/>
+              <w:bottom w:type="dxa" w:w="60"/>
+              <w:right w:type="dxa" w:w="100"/>
+            </w:tcMar>
+          </w:tcPr>
+          <w:p>
+            <w:r>
+              <w:rPr>
+                <w:b/>
+                <w:bCs/>
+              </w:rPr>
+              <w:t xml:space="preserve">interview</w:t>
+            </w:r>
+          </w:p>
+        </w:tc>
+        <w:tc>
+          <w:tcPr>
+            <w:tcW w:type="dxa" w:w="6747"/>
+            <w:tcMar>
+              <w:top w:type="dxa" w:w="60"/>
+              <w:left w:type="dxa" w:w="100"/>
+              <w:bottom w:type="dxa" w:w="60"/>
+              <w:right w:type="dxa" w:w="100"/>
+            </w:tcMar>
+          </w:tcPr>
+          <w:p>
+            <w:r>
+              <w:t xml:space="preserve">a formal meeting in which an employer asks an applicant questions to decide whether to give them the job.</w:t>
+            </w:r>
+          </w:p>
+        </w:tc>
+      </w:tr>
+    </w:tbl>
+    <w:p>
+      <w:pPr>
         <w:pStyle w:val="Heading1"/>
         <w:spacing w:after="120" w:before="320"/>
       </w:pPr>
@@ -612,6 +1000,434 @@
         </w:rPr>
         <w:t xml:space="preserve">A. Present perfect ou past simple</w:t>
       </w:r>
+    </w:p>
+    <w:p>
+      <w:pPr>
+        <w:spacing w:after="100"/>
+      </w:pPr>
+      <w:r>
+        <w:rPr>
+          <w:b/>
+          <w:bCs/>
+        </w:rPr>
+        <w:t xml:space="preserve">Le tableau des temps vu en TD :</w:t>
+      </w:r>
+    </w:p>
+    <w:tbl>
+      <w:tblPr>
+        <w:tblW w:type="dxa" w:w="9638"/>
+        <w:tblBorders>
+          <w:top w:val="single" w:color="auto" w:sz="4"/>
+          <w:left w:val="single" w:color="auto" w:sz="4"/>
+          <w:bottom w:val="single" w:color="auto" w:sz="4"/>
+          <w:right w:val="single" w:color="auto" w:sz="4"/>
+          <w:insideH w:val="single" w:color="auto" w:sz="4"/>
+          <w:insideV w:val="single" w:color="auto" w:sz="4"/>
+        </w:tblBorders>
+      </w:tblPr>
+      <w:tblGrid>
+        <w:gridCol w:w="1606"/>
+        <w:gridCol w:w="2410"/>
+        <w:gridCol w:w="3213"/>
+        <w:gridCol w:w="2409"/>
+      </w:tblGrid>
+      <w:tr>
+        <w:trPr>
+          <w:tblHeader/>
+        </w:trPr>
+        <w:tc>
+          <w:tcPr>
+            <w:tcW w:type="dxa" w:w="1606"/>
+            <w:shd w:fill="1F4E79" w:color="auto" w:val="clear"/>
+            <w:tcMar>
+              <w:top w:type="dxa" w:w="60"/>
+              <w:left w:type="dxa" w:w="100"/>
+              <w:bottom w:type="dxa" w:w="60"/>
+              <w:right w:type="dxa" w:w="100"/>
+            </w:tcMar>
+          </w:tcPr>
+          <w:p>
+            <w:r>
+              <w:rPr>
+                <w:b/>
+                <w:bCs/>
+                <w:color w:val="FFFFFF"/>
+              </w:rPr>
+              <w:t xml:space="preserve">Temps</w:t>
+            </w:r>
+          </w:p>
+        </w:tc>
+        <w:tc>
+          <w:tcPr>
+            <w:tcW w:type="dxa" w:w="2410"/>
+            <w:shd w:fill="1F4E79" w:color="auto" w:val="clear"/>
+            <w:tcMar>
+              <w:top w:type="dxa" w:w="60"/>
+              <w:left w:type="dxa" w:w="100"/>
+              <w:bottom w:type="dxa" w:w="60"/>
+              <w:right w:type="dxa" w:w="100"/>
+            </w:tcMar>
+          </w:tcPr>
+          <w:p>
+            <w:r>
+              <w:rPr>
+                <w:b/>
+                <w:bCs/>
+                <w:color w:val="FFFFFF"/>
+              </w:rPr>
+              <w:t xml:space="preserve">Construction</w:t>
+            </w:r>
+          </w:p>
+        </w:tc>
+        <w:tc>
+          <w:tcPr>
+            <w:tcW w:type="dxa" w:w="3213"/>
+            <w:shd w:fill="1F4E79" w:color="auto" w:val="clear"/>
+            <w:tcMar>
+              <w:top w:type="dxa" w:w="60"/>
+              <w:left w:type="dxa" w:w="100"/>
+              <w:bottom w:type="dxa" w:w="60"/>
+              <w:right w:type="dxa" w:w="100"/>
+            </w:tcMar>
+          </w:tcPr>
+          <w:p>
+            <w:r>
+              <w:rPr>
+                <w:b/>
+                <w:bCs/>
+                <w:color w:val="FFFFFF"/>
+              </w:rPr>
+              <w:t xml:space="preserve">Utilisation</w:t>
+            </w:r>
+          </w:p>
+        </w:tc>
+        <w:tc>
+          <w:tcPr>
+            <w:tcW w:type="dxa" w:w="2409"/>
+            <w:shd w:fill="1F4E79" w:color="auto" w:val="clear"/>
+            <w:tcMar>
+              <w:top w:type="dxa" w:w="60"/>
+              <w:left w:type="dxa" w:w="100"/>
+              <w:bottom w:type="dxa" w:w="60"/>
+              <w:right w:type="dxa" w:w="100"/>
+            </w:tcMar>
+          </w:tcPr>
+          <w:p>
+            <w:r>
+              <w:rPr>
+                <w:b/>
+                <w:bCs/>
+                <w:color w:val="FFFFFF"/>
+              </w:rPr>
+              <w:t xml:space="preserve">Exemple du TD</w:t>
+            </w:r>
+          </w:p>
+        </w:tc>
+      </w:tr>
+      <w:tr>
+        <w:tc>
+          <w:tcPr>
+            <w:tcW w:type="dxa" w:w="1606"/>
+            <w:tcMar>
+              <w:top w:type="dxa" w:w="60"/>
+              <w:left w:type="dxa" w:w="100"/>
+              <w:bottom w:type="dxa" w:w="60"/>
+              <w:right w:type="dxa" w:w="100"/>
+            </w:tcMar>
+          </w:tcPr>
+          <w:p>
+            <w:r>
+              <w:rPr>
+                <w:b/>
+                <w:bCs/>
+              </w:rPr>
+              <w:t xml:space="preserve">Présent simple</w:t>
+            </w:r>
+          </w:p>
+        </w:tc>
+        <w:tc>
+          <w:tcPr>
+            <w:tcW w:type="dxa" w:w="2410"/>
+            <w:tcMar>
+              <w:top w:type="dxa" w:w="60"/>
+              <w:left w:type="dxa" w:w="100"/>
+              <w:bottom w:type="dxa" w:w="60"/>
+              <w:right w:type="dxa" w:w="100"/>
+            </w:tcMar>
+          </w:tcPr>
+          <w:p>
+            <w:r>
+              <w:t xml:space="preserve">base verbale (+ s à la 3ᵉ personne)</w:t>
+            </w:r>
+          </w:p>
+        </w:tc>
+        <w:tc>
+          <w:tcPr>
+            <w:tcW w:type="dxa" w:w="3213"/>
+            <w:tcMar>
+              <w:top w:type="dxa" w:w="60"/>
+              <w:left w:type="dxa" w:w="100"/>
+              <w:bottom w:type="dxa" w:w="60"/>
+              <w:right w:type="dxa" w:w="100"/>
+            </w:tcMar>
+          </w:tcPr>
+          <w:p>
+            <w:r>
+              <w:t xml:space="preserve">Habitudes, caractéristiques</w:t>
+            </w:r>
+          </w:p>
+        </w:tc>
+        <w:tc>
+          <w:tcPr>
+            <w:tcW w:type="dxa" w:w="2409"/>
+            <w:tcMar>
+              <w:top w:type="dxa" w:w="60"/>
+              <w:left w:type="dxa" w:w="100"/>
+              <w:bottom w:type="dxa" w:w="60"/>
+              <w:right w:type="dxa" w:w="100"/>
+            </w:tcMar>
+          </w:tcPr>
+          <w:p>
+            <w:r>
+              <w:rPr>
+                <w:i/>
+                <w:iCs/>
+              </w:rPr>
+              <w:t xml:space="preserve">I identify – I don't identify – Do you identify?</w:t>
+            </w:r>
+          </w:p>
+        </w:tc>
+      </w:tr>
+      <w:tr>
+        <w:tc>
+          <w:tcPr>
+            <w:tcW w:type="dxa" w:w="1606"/>
+            <w:tcMar>
+              <w:top w:type="dxa" w:w="60"/>
+              <w:left w:type="dxa" w:w="100"/>
+              <w:bottom w:type="dxa" w:w="60"/>
+              <w:right w:type="dxa" w:w="100"/>
+            </w:tcMar>
+          </w:tcPr>
+          <w:p>
+            <w:r>
+              <w:rPr>
+                <w:b/>
+                <w:bCs/>
+              </w:rPr>
+              <w:t xml:space="preserve">Présent progressif</w:t>
+            </w:r>
+          </w:p>
+        </w:tc>
+        <w:tc>
+          <w:tcPr>
+            <w:tcW w:type="dxa" w:w="2410"/>
+            <w:tcMar>
+              <w:top w:type="dxa" w:w="60"/>
+              <w:left w:type="dxa" w:w="100"/>
+              <w:bottom w:type="dxa" w:w="60"/>
+              <w:right w:type="dxa" w:w="100"/>
+            </w:tcMar>
+          </w:tcPr>
+          <w:p>
+            <w:r>
+              <w:t xml:space="preserve">be + verbe -ing</w:t>
+            </w:r>
+          </w:p>
+        </w:tc>
+        <w:tc>
+          <w:tcPr>
+            <w:tcW w:type="dxa" w:w="3213"/>
+            <w:tcMar>
+              <w:top w:type="dxa" w:w="60"/>
+              <w:left w:type="dxa" w:w="100"/>
+              <w:bottom w:type="dxa" w:w="60"/>
+              <w:right w:type="dxa" w:w="100"/>
+            </w:tcMar>
+          </w:tcPr>
+          <w:p>
+            <w:r>
+              <w:t xml:space="preserve">Action en train de se dérouler</w:t>
+            </w:r>
+          </w:p>
+        </w:tc>
+        <w:tc>
+          <w:tcPr>
+            <w:tcW w:type="dxa" w:w="2409"/>
+            <w:tcMar>
+              <w:top w:type="dxa" w:w="60"/>
+              <w:left w:type="dxa" w:w="100"/>
+              <w:bottom w:type="dxa" w:w="60"/>
+              <w:right w:type="dxa" w:w="100"/>
+            </w:tcMar>
+          </w:tcPr>
+          <w:p>
+            <w:r>
+              <w:rPr>
+                <w:i/>
+                <w:iCs/>
+              </w:rPr>
+              <w:t xml:space="preserve">I am looking for – I am not looking for – Are you looking for?</w:t>
+            </w:r>
+          </w:p>
+        </w:tc>
+      </w:tr>
+      <w:tr>
+        <w:tc>
+          <w:tcPr>
+            <w:tcW w:type="dxa" w:w="1606"/>
+            <w:tcMar>
+              <w:top w:type="dxa" w:w="60"/>
+              <w:left w:type="dxa" w:w="100"/>
+              <w:bottom w:type="dxa" w:w="60"/>
+              <w:right w:type="dxa" w:w="100"/>
+            </w:tcMar>
+          </w:tcPr>
+          <w:p>
+            <w:r>
+              <w:rPr>
+                <w:b/>
+                <w:bCs/>
+              </w:rPr>
+              <w:t xml:space="preserve">Present perfect</w:t>
+            </w:r>
+          </w:p>
+        </w:tc>
+        <w:tc>
+          <w:tcPr>
+            <w:tcW w:type="dxa" w:w="2410"/>
+            <w:tcMar>
+              <w:top w:type="dxa" w:w="60"/>
+              <w:left w:type="dxa" w:w="100"/>
+              <w:bottom w:type="dxa" w:w="60"/>
+              <w:right w:type="dxa" w:w="100"/>
+            </w:tcMar>
+          </w:tcPr>
+          <w:p>
+            <w:r>
+              <w:t xml:space="preserve">have / has + participe passé</w:t>
+            </w:r>
+          </w:p>
+        </w:tc>
+        <w:tc>
+          <w:tcPr>
+            <w:tcW w:type="dxa" w:w="3213"/>
+            <w:tcMar>
+              <w:top w:type="dxa" w:w="60"/>
+              <w:left w:type="dxa" w:w="100"/>
+              <w:bottom w:type="dxa" w:w="60"/>
+              <w:right w:type="dxa" w:w="100"/>
+            </w:tcMar>
+          </w:tcPr>
+          <w:p>
+            <w:r>
+              <w:t xml:space="preserve">Action commencée dans le passé qui se poursuit ou a des conséquences dans le présent ; moment non précis</w:t>
+            </w:r>
+          </w:p>
+        </w:tc>
+        <w:tc>
+          <w:tcPr>
+            <w:tcW w:type="dxa" w:w="2409"/>
+            <w:tcMar>
+              <w:top w:type="dxa" w:w="60"/>
+              <w:left w:type="dxa" w:w="100"/>
+              <w:bottom w:type="dxa" w:w="60"/>
+              <w:right w:type="dxa" w:w="100"/>
+            </w:tcMar>
+          </w:tcPr>
+          <w:p>
+            <w:r>
+              <w:rPr>
+                <w:i/>
+                <w:iCs/>
+              </w:rPr>
+              <w:t xml:space="preserve">I have known – I haven't known – Have you known?</w:t>
+            </w:r>
+          </w:p>
+        </w:tc>
+      </w:tr>
+      <w:tr>
+        <w:tc>
+          <w:tcPr>
+            <w:tcW w:type="dxa" w:w="1606"/>
+            <w:tcMar>
+              <w:top w:type="dxa" w:w="60"/>
+              <w:left w:type="dxa" w:w="100"/>
+              <w:bottom w:type="dxa" w:w="60"/>
+              <w:right w:type="dxa" w:w="100"/>
+            </w:tcMar>
+          </w:tcPr>
+          <w:p>
+            <w:r>
+              <w:rPr>
+                <w:b/>
+                <w:bCs/>
+              </w:rPr>
+              <w:t xml:space="preserve">Past simple</w:t>
+            </w:r>
+            <w:r>
+              <w:t xml:space="preserve"> (prétérit)</w:t>
+            </w:r>
+          </w:p>
+        </w:tc>
+        <w:tc>
+          <w:tcPr>
+            <w:tcW w:type="dxa" w:w="2410"/>
+            <w:tcMar>
+              <w:top w:type="dxa" w:w="60"/>
+              <w:left w:type="dxa" w:w="100"/>
+              <w:bottom w:type="dxa" w:w="60"/>
+              <w:right w:type="dxa" w:w="100"/>
+            </w:tcMar>
+          </w:tcPr>
+          <w:p>
+            <w:r>
+              <w:t xml:space="preserve">verbe + ed (ou forme irrégulière)</w:t>
+            </w:r>
+          </w:p>
+        </w:tc>
+        <w:tc>
+          <w:tcPr>
+            <w:tcW w:type="dxa" w:w="3213"/>
+            <w:tcMar>
+              <w:top w:type="dxa" w:w="60"/>
+              <w:left w:type="dxa" w:w="100"/>
+              <w:bottom w:type="dxa" w:w="60"/>
+              <w:right w:type="dxa" w:w="100"/>
+            </w:tcMar>
+          </w:tcPr>
+          <w:p>
+            <w:r>
+              <w:t xml:space="preserve">Action commencée et terminée dans le passé ; moment précis</w:t>
+            </w:r>
+          </w:p>
+        </w:tc>
+        <w:tc>
+          <w:tcPr>
+            <w:tcW w:type="dxa" w:w="2409"/>
+            <w:tcMar>
+              <w:top w:type="dxa" w:w="60"/>
+              <w:left w:type="dxa" w:w="100"/>
+              <w:bottom w:type="dxa" w:w="60"/>
+              <w:right w:type="dxa" w:w="100"/>
+            </w:tcMar>
+          </w:tcPr>
+          <w:p>
+            <w:r>
+              <w:rPr>
+                <w:i/>
+                <w:iCs/>
+              </w:rPr>
+              <w:t xml:space="preserve">She suggested.</w:t>
+            </w:r>
+          </w:p>
+        </w:tc>
+      </w:tr>
+    </w:tbl>
+    <w:p>
+      <w:pPr>
+        <w:spacing w:after="60"/>
+      </w:pPr>
     </w:p>
     <w:tbl>
       <w:tblPr>
@@ -2534,6 +3350,114 @@
         <w:t xml:space="preserve"> est ici une préposition).</w:t>
       </w:r>
     </w:p>
+    <w:tbl>
+      <w:tblPr>
+        <w:tblW w:type="dxa" w:w="9638"/>
+        <w:tblBorders>
+          <w:top w:val="single" w:color="auto" w:sz="4"/>
+          <w:left w:val="single" w:color="auto" w:sz="4"/>
+          <w:bottom w:val="single" w:color="auto" w:sz="4"/>
+          <w:right w:val="single" w:color="auto" w:sz="4"/>
+          <w:insideH w:val="single" w:color="auto" w:sz="4"/>
+          <w:insideV w:val="single" w:color="auto" w:sz="4"/>
+        </w:tblBorders>
+      </w:tblPr>
+      <w:tblGrid>
+        <w:gridCol w:w="4819"/>
+        <w:gridCol w:w="4819"/>
+      </w:tblGrid>
+      <w:tr>
+        <w:trPr>
+          <w:tblHeader/>
+        </w:trPr>
+        <w:tc>
+          <w:tcPr>
+            <w:tcW w:type="dxa" w:w="4819"/>
+            <w:shd w:fill="1F4E79" w:color="auto" w:val="clear"/>
+            <w:tcMar>
+              <w:top w:type="dxa" w:w="60"/>
+              <w:left w:type="dxa" w:w="100"/>
+              <w:bottom w:type="dxa" w:w="60"/>
+              <w:right w:type="dxa" w:w="100"/>
+            </w:tcMar>
+          </w:tcPr>
+          <w:p>
+            <w:r>
+              <w:rPr>
+                <w:b/>
+                <w:bCs/>
+                <w:color w:val="FFFFFF"/>
+              </w:rPr>
+              <w:t xml:space="preserve">FOR + durée</w:t>
+            </w:r>
+          </w:p>
+        </w:tc>
+        <w:tc>
+          <w:tcPr>
+            <w:tcW w:type="dxa" w:w="4819"/>
+            <w:shd w:fill="1F4E79" w:color="auto" w:val="clear"/>
+            <w:tcMar>
+              <w:top w:type="dxa" w:w="60"/>
+              <w:left w:type="dxa" w:w="100"/>
+              <w:bottom w:type="dxa" w:w="60"/>
+              <w:right w:type="dxa" w:w="100"/>
+            </w:tcMar>
+          </w:tcPr>
+          <w:p>
+            <w:r>
+              <w:rPr>
+                <w:b/>
+                <w:bCs/>
+                <w:color w:val="FFFFFF"/>
+              </w:rPr>
+              <w:t xml:space="preserve">SINCE + point de départ</w:t>
+            </w:r>
+          </w:p>
+        </w:tc>
+      </w:tr>
+      <w:tr>
+        <w:tc>
+          <w:tcPr>
+            <w:tcW w:type="dxa" w:w="4819"/>
+            <w:tcMar>
+              <w:top w:type="dxa" w:w="60"/>
+              <w:left w:type="dxa" w:w="100"/>
+              <w:bottom w:type="dxa" w:w="60"/>
+              <w:right w:type="dxa" w:w="100"/>
+            </w:tcMar>
+          </w:tcPr>
+          <w:p>
+            <w:r>
+              <w:rPr>
+                <w:i/>
+                <w:iCs/>
+              </w:rPr>
+              <w:t xml:space="preserve">for 7 years, for a week, for two months, for a long time, for ages</w:t>
+            </w:r>
+          </w:p>
+        </w:tc>
+        <w:tc>
+          <w:tcPr>
+            <w:tcW w:type="dxa" w:w="4819"/>
+            <w:tcMar>
+              <w:top w:type="dxa" w:w="60"/>
+              <w:left w:type="dxa" w:w="100"/>
+              <w:bottom w:type="dxa" w:w="60"/>
+              <w:right w:type="dxa" w:w="100"/>
+            </w:tcMar>
+          </w:tcPr>
+          <w:p>
+            <w:r>
+              <w:rPr>
+                <w:i/>
+                <w:iCs/>
+              </w:rPr>
+              <w:t xml:space="preserve">since 2020, since Christmas, since I was born, since September</w:t>
+            </w:r>
+          </w:p>
+        </w:tc>
+      </w:tr>
+    </w:tbl>
     <w:p>
       <w:pPr>
         <w:pStyle w:val="Heading2"/>
@@ -2544,6 +3468,81 @@
           <w:color w:val="1F4E79"/>
         </w:rPr>
         <w:t xml:space="preserve">C. Action, linking et helping verbs</w:t>
+      </w:r>
+    </w:p>
+    <w:p>
+      <w:pPr>
+        <w:spacing w:after="100"/>
+      </w:pPr>
+      <w:r>
+        <w:rPr>
+          <w:b/>
+          <w:bCs/>
+        </w:rPr>
+        <w:t xml:space="preserve">Le classement de l'exercice du TD :</w:t>
+      </w:r>
+      <w:r>
+        <w:t xml:space="preserve"> linking : </w:t>
+      </w:r>
+      <w:r>
+        <w:rPr>
+          <w:i/>
+          <w:iCs/>
+        </w:rPr>
+        <w:t xml:space="preserve">appear, become, be, feel, remain, smell, look</w:t>
+      </w:r>
+      <w:r>
+        <w:t xml:space="preserve"> ; action : </w:t>
+      </w:r>
+      <w:r>
+        <w:rPr>
+          <w:i/>
+          <w:iCs/>
+        </w:rPr>
+        <w:t xml:space="preserve">answer, arrange, assist, organise, prepare, welcome, study, contact, look, do</w:t>
+      </w:r>
+      <w:r>
+        <w:t xml:space="preserve"> ; helping : </w:t>
+      </w:r>
+      <w:r>
+        <w:rPr>
+          <w:i/>
+          <w:iCs/>
+        </w:rPr>
+        <w:t xml:space="preserve">can, do, have, must, should, be</w:t>
+      </w:r>
+      <w:r>
+        <w:t xml:space="preserve">. Remarque que </w:t>
+      </w:r>
+      <w:r>
+        <w:rPr>
+          <w:i/>
+          <w:iCs/>
+        </w:rPr>
+        <w:t xml:space="preserve">look</w:t>
+      </w:r>
+      <w:r>
+        <w:t xml:space="preserve">, </w:t>
+      </w:r>
+      <w:r>
+        <w:rPr>
+          <w:i/>
+          <w:iCs/>
+        </w:rPr>
+        <w:t xml:space="preserve">do</w:t>
+      </w:r>
+      <w:r>
+        <w:t xml:space="preserve"> et </w:t>
+      </w:r>
+      <w:r>
+        <w:rPr>
+          <w:i/>
+          <w:iCs/>
+        </w:rPr>
+        <w:t xml:space="preserve">be</w:t>
+      </w:r>
+      <w:r>
+        <w:t xml:space="preserve"> apparaissent dans deux colonnes.</w:t>
       </w:r>
     </w:p>
     <w:tbl>
@@ -3927,7 +4926,36 @@
         <w:spacing w:after="100"/>
       </w:pPr>
       <w:r>
-        <w:t xml:space="preserve">Les réflexes donnés par la consigne du professeur (à compléter après la séance sur l'e-mail) :</w:t>
+        <w:rPr>
+          <w:b/>
+          <w:bCs/>
+        </w:rPr>
+        <w:t xml:space="preserve">La consigne :</w:t>
+      </w:r>
+      <w:r>
+        <w:t xml:space="preserve"> rédiger un e-mail de candidature d'environ 120 mots, à partir d'un court CV et d'une offre de stage. </w:t>
+      </w:r>
+      <w:r>
+        <w:rPr>
+          <w:b/>
+          <w:bCs/>
+        </w:rPr>
+        <w:t xml:space="preserve">Critères :</w:t>
+      </w:r>
+      <w:r>
+        <w:t xml:space="preserve"> organisation et format ; contenu et pertinence ; grammaire et syntaxe ; vocabulaire professionnel ; cohérence et fluidité.</w:t>
+      </w:r>
+    </w:p>
+    <w:p>
+      <w:pPr>
+        <w:pStyle w:val="Heading2"/>
+        <w:spacing w:after="100" w:before="200"/>
+      </w:pPr>
+      <w:r>
+        <w:rPr>
+          <w:color w:val="1F4E79"/>
+        </w:rPr>
+        <w:t xml:space="preserve">Les 4 règles d'or</w:t>
       </w:r>
     </w:p>
     <w:tbl>
@@ -3968,7 +4996,7 @@
                 <w:bCs/>
                 <w:color w:val="FFFFFF"/>
               </w:rPr>
-              <w:t xml:space="preserve">Réflexe</w:t>
+              <w:t xml:space="preserve">Règle</w:t>
             </w:r>
           </w:p>
         </w:tc>
@@ -4012,10 +5040,10 @@
                 <w:b/>
                 <w:bCs/>
               </w:rPr>
-              <w:t xml:space="preserve">Respecter la structure d'un e-mail professionnel</w:t>
-            </w:r>
-            <w:r>
-              <w:t xml:space="preserve"> : objet, formule d'appel, paragraphes, formule de clôture, signature</w:t>
+              <w:t xml:space="preserve">Adapter, ne pas recopier le CV</w:t>
+            </w:r>
+            <w:r>
+              <w:t xml:space="preserve"> : ne garder que ce qui correspond à l'offre</w:t>
             </w:r>
           </w:p>
         </w:tc>
@@ -4031,7 +5059,7 @@
           </w:tcPr>
           <w:p>
             <w:r>
-              <w:t xml:space="preserve">Le critère « organisation et format »</w:t>
+              <w:t xml:space="preserve">Le critère « contenu et pertinence »</w:t>
             </w:r>
           </w:p>
         </w:tc>
@@ -4053,10 +5081,7 @@
                 <w:b/>
                 <w:bCs/>
               </w:rPr>
-              <w:t xml:space="preserve">Adapter le CV à l'offre, sans le recopier</w:t>
-            </w:r>
-            <w:r>
-              <w:t xml:space="preserve"> : relier chacune de tes expériences à une exigence de l'offre</w:t>
+              <w:t xml:space="preserve">Une exigence de l'offre → une preuve concrète tirée du CV</w:t>
             </w:r>
           </w:p>
         </w:tc>
@@ -4072,7 +5097,7 @@
           </w:tcPr>
           <w:p>
             <w:r>
-              <w:t xml:space="preserve">Le critère « contenu et pertinence »</w:t>
+              <w:t xml:space="preserve">C'est ce qui fait la note de contenu</w:t>
             </w:r>
           </w:p>
         </w:tc>
@@ -4094,7 +5119,37 @@
                 <w:b/>
                 <w:bCs/>
               </w:rPr>
-              <w:t xml:space="preserve">Environ 120 mots</w:t>
+              <w:t xml:space="preserve">Un registre formel</w:t>
+            </w:r>
+            <w:r>
+              <w:t xml:space="preserve"> : pas de contractions (</w:t>
+            </w:r>
+            <w:r>
+              <w:rPr>
+                <w:i/>
+                <w:iCs/>
+              </w:rPr>
+              <w:t xml:space="preserve">I'm, don't</w:t>
+            </w:r>
+            <w:r>
+              <w:t xml:space="preserve">), pas de </w:t>
+            </w:r>
+            <w:r>
+              <w:rPr>
+                <w:i/>
+                <w:iCs/>
+              </w:rPr>
+              <w:t xml:space="preserve">Hello</w:t>
+            </w:r>
+            <w:r>
+              <w:t xml:space="preserve"> ni de </w:t>
+            </w:r>
+            <w:r>
+              <w:rPr>
+                <w:i/>
+                <w:iCs/>
+              </w:rPr>
+              <w:t xml:space="preserve">Hi</w:t>
             </w:r>
           </w:p>
         </w:tc>
@@ -4110,7 +5165,7 @@
           </w:tcPr>
           <w:p>
             <w:r>
-              <w:t xml:space="preserve">Ni trop court, ni trop long</w:t>
+              <w:t xml:space="preserve">Le critère « vocabulaire professionnel »</w:t>
             </w:r>
           </w:p>
         </w:tc>
@@ -4132,10 +5187,10 @@
                 <w:b/>
                 <w:bCs/>
               </w:rPr>
-              <w:t xml:space="preserve">Réutiliser les formules figées</w:t>
-            </w:r>
-            <w:r>
-              <w:t xml:space="preserve"> (parties B et 3)</w:t>
+              <w:t xml:space="preserve">Les bons temps</w:t>
+            </w:r>
+            <w:r>
+              <w:t xml:space="preserve"> : past simple pour une expérience terminée ; present perfect pour une expérience en cours</w:t>
             </w:r>
           </w:p>
         </w:tc>
@@ -4151,35 +5206,410 @@
           </w:tcPr>
           <w:p>
             <w:r>
-              <w:t xml:space="preserve">Le critère « vocabulaire professionnel »</w:t>
-            </w:r>
-          </w:p>
-        </w:tc>
-      </w:tr>
-      <w:tr>
+              <w:t xml:space="preserve">Le critère « grammaire »</w:t>
+            </w:r>
+          </w:p>
+        </w:tc>
+      </w:tr>
+    </w:tbl>
+    <w:p>
+      <w:pPr>
+        <w:pStyle w:val="Heading2"/>
+        <w:spacing w:after="100" w:before="200"/>
+      </w:pPr>
+      <w:r>
+        <w:rPr>
+          <w:color w:val="1F4E79"/>
+        </w:rPr>
+        <w:t xml:space="preserve">Le plan du professeur (d'après tes notes)</w:t>
+      </w:r>
+    </w:p>
+    <w:p>
+      <w:pPr>
+        <w:spacing w:after="100"/>
+      </w:pPr>
+      <w:r>
+        <w:rPr>
+          <w:b/>
+          <w:bCs/>
+        </w:rPr>
+        <w:t xml:space="preserve">1.</w:t>
+      </w:r>
+      <w:r>
+        <w:t xml:space="preserve"> What position you are applying for → </w:t>
+      </w:r>
+      <w:r>
+        <w:rPr>
+          <w:b/>
+          <w:bCs/>
+        </w:rPr>
+        <w:t xml:space="preserve">2.</w:t>
+      </w:r>
+      <w:r>
+        <w:t xml:space="preserve"> Why you want the job → </w:t>
+      </w:r>
+      <w:r>
+        <w:rPr>
+          <w:b/>
+          <w:bCs/>
+        </w:rPr>
+        <w:t xml:space="preserve">3.</w:t>
+      </w:r>
+      <w:r>
+        <w:t xml:space="preserve"> Why you → puis la conclusion (</w:t>
+      </w:r>
+      <w:r>
+        <w:rPr>
+          <w:i/>
+          <w:iCs/>
+        </w:rPr>
+        <w:t xml:space="preserve">Looking forward to hearing from you.</w:t>
+      </w:r>
+      <w:r>
+        <w:t xml:space="preserve">).</w:t>
+      </w:r>
+    </w:p>
+    <w:p>
+      <w:pPr>
+        <w:pStyle w:val="Heading2"/>
+        <w:spacing w:after="100" w:before="200"/>
+      </w:pPr>
+      <w:r>
+        <w:rPr>
+          <w:color w:val="1F4E79"/>
+        </w:rPr>
+        <w:t xml:space="preserve">Le modèle à trous</w:t>
+      </w:r>
+    </w:p>
+    <w:p>
+      <w:pPr>
+        <w:pBdr>
+          <w:left w:val="single" w:color="BF9000" w:sz="18" w:space="6"/>
+        </w:pBdr>
+        <w:shd w:fill="DEEAF6" w:color="auto" w:val="clear"/>
+        <w:spacing w:after="120" w:before="80"/>
+      </w:pPr>
+      <w:r>
+        <w:rPr>
+          <w:b/>
+          <w:bCs/>
+        </w:rPr>
+        <w:t xml:space="preserve">Subject:</w:t>
+      </w:r>
+      <w:r>
+        <w:t xml:space="preserve"> Application for the [POSTE] position – [PRÉNOM NOM]</w:t>
+      </w:r>
+    </w:p>
+    <w:p>
+      <w:pPr>
+        <w:pBdr>
+          <w:left w:val="single" w:color="BF9000" w:sz="18" w:space="6"/>
+        </w:pBdr>
+        <w:shd w:fill="DEEAF6" w:color="auto" w:val="clear"/>
+        <w:spacing w:after="120" w:before="80"/>
+      </w:pPr>
+      <w:r>
+        <w:t xml:space="preserve">Dear [Mr / Ms NOM], </w:t>
+      </w:r>
+      <w:r>
+        <w:rPr>
+          <w:i/>
+          <w:iCs/>
+        </w:rPr>
+        <w:t xml:space="preserve">(ou Dear Sir or Madam, si le nom est inconnu)</w:t>
+      </w:r>
+    </w:p>
+    <w:p>
+      <w:pPr>
+        <w:pBdr>
+          <w:left w:val="single" w:color="BF9000" w:sz="18" w:space="6"/>
+        </w:pBdr>
+        <w:shd w:fill="DEEAF6" w:color="auto" w:val="clear"/>
+        <w:spacing w:after="120" w:before="80"/>
+      </w:pPr>
+      <w:r>
+        <w:rPr>
+          <w:b/>
+          <w:bCs/>
+        </w:rPr>
+        <w:t xml:space="preserve">§1 – Le poste.</w:t>
+      </w:r>
+      <w:r>
+        <w:t xml:space="preserve"> I am writing to apply </w:t>
+      </w:r>
+      <w:r>
+        <w:rPr>
+          <w:b/>
+          <w:bCs/>
+        </w:rPr>
+        <w:t xml:space="preserve">for</w:t>
+      </w:r>
+      <w:r>
+        <w:t xml:space="preserve"> the position </w:t>
+      </w:r>
+      <w:r>
+        <w:rPr>
+          <w:b/>
+          <w:bCs/>
+        </w:rPr>
+        <w:t xml:space="preserve">of</w:t>
+      </w:r>
+      <w:r>
+        <w:t xml:space="preserve"> [POSTE] advertised </w:t>
+      </w:r>
+      <w:r>
+        <w:rPr>
+          <w:b/>
+          <w:bCs/>
+        </w:rPr>
+        <w:t xml:space="preserve">on</w:t>
+      </w:r>
+      <w:r>
+        <w:t xml:space="preserve"> [SITE]. I am currently in the second year of a bachelor's degree in management </w:t>
+      </w:r>
+      <w:r>
+        <w:rPr>
+          <w:b/>
+          <w:bCs/>
+        </w:rPr>
+        <w:t xml:space="preserve">at</w:t>
+      </w:r>
+      <w:r>
+        <w:t xml:space="preserve"> IAE Lyon.</w:t>
+      </w:r>
+    </w:p>
+    <w:p>
+      <w:pPr>
+        <w:pBdr>
+          <w:left w:val="single" w:color="BF9000" w:sz="18" w:space="6"/>
+        </w:pBdr>
+        <w:shd w:fill="DEEAF6" w:color="auto" w:val="clear"/>
+        <w:spacing w:after="120" w:before="80"/>
+      </w:pPr>
+      <w:r>
+        <w:rPr>
+          <w:b/>
+          <w:bCs/>
+        </w:rPr>
+        <w:t xml:space="preserve">§2 – Pourquoi ce poste.</w:t>
+      </w:r>
+      <w:r>
+        <w:t xml:space="preserve"> I am particularly interested </w:t>
+      </w:r>
+      <w:r>
+        <w:rPr>
+          <w:b/>
+          <w:bCs/>
+        </w:rPr>
+        <w:t xml:space="preserve">in</w:t>
+      </w:r>
+      <w:r>
+        <w:t xml:space="preserve"> [ENTREPRISE] because [RAISON TIRÉE DE L'OFFRE]. I would be delighted </w:t>
+      </w:r>
+      <w:r>
+        <w:rPr>
+          <w:b/>
+          <w:bCs/>
+        </w:rPr>
+        <w:t xml:space="preserve">to</w:t>
+      </w:r>
+      <w:r>
+        <w:t xml:space="preserve"> contribute </w:t>
+      </w:r>
+      <w:r>
+        <w:rPr>
+          <w:b/>
+          <w:bCs/>
+        </w:rPr>
+        <w:t xml:space="preserve">to</w:t>
+      </w:r>
+      <w:r>
+        <w:t xml:space="preserve"> your team.</w:t>
+      </w:r>
+    </w:p>
+    <w:p>
+      <w:pPr>
+        <w:pBdr>
+          <w:left w:val="single" w:color="BF9000" w:sz="18" w:space="6"/>
+        </w:pBdr>
+        <w:shd w:fill="DEEAF6" w:color="auto" w:val="clear"/>
+        <w:spacing w:after="120" w:before="80"/>
+      </w:pPr>
+      <w:r>
+        <w:rPr>
+          <w:b/>
+          <w:bCs/>
+        </w:rPr>
+        <w:t xml:space="preserve">§3 – Pourquoi toi.</w:t>
+      </w:r>
+      <w:r>
+        <w:t xml:space="preserve"> I believe my profile matches your requirements. [PREUVE 1]. [PREUVE 2]. In addition, I am proficient </w:t>
+      </w:r>
+      <w:r>
+        <w:rPr>
+          <w:b/>
+          <w:bCs/>
+        </w:rPr>
+        <w:t xml:space="preserve">in</w:t>
+      </w:r>
+      <w:r>
+        <w:t xml:space="preserve"> [LOGICIELS] and my English is [fluent / at a B2 level].</w:t>
+      </w:r>
+    </w:p>
+    <w:p>
+      <w:pPr>
+        <w:pBdr>
+          <w:left w:val="single" w:color="BF9000" w:sz="18" w:space="6"/>
+        </w:pBdr>
+        <w:shd w:fill="DEEAF6" w:color="auto" w:val="clear"/>
+        <w:spacing w:after="120" w:before="80"/>
+      </w:pPr>
+      <w:r>
+        <w:rPr>
+          <w:b/>
+          <w:bCs/>
+        </w:rPr>
+        <w:t xml:space="preserve">§4 – Conclusion.</w:t>
+      </w:r>
+      <w:r>
+        <w:t xml:space="preserve"> I am available </w:t>
+      </w:r>
+      <w:r>
+        <w:rPr>
+          <w:b/>
+          <w:bCs/>
+        </w:rPr>
+        <w:t xml:space="preserve">from</w:t>
+      </w:r>
+      <w:r>
+        <w:t xml:space="preserve"> [DATE] </w:t>
+      </w:r>
+      <w:r>
+        <w:rPr>
+          <w:b/>
+          <w:bCs/>
+        </w:rPr>
+        <w:t xml:space="preserve">to</w:t>
+      </w:r>
+      <w:r>
+        <w:t xml:space="preserve"> [DATE]. Please find my CV attached. I would welcome the opportunity to discuss my application at an interview. I look forward </w:t>
+      </w:r>
+      <w:r>
+        <w:rPr>
+          <w:b/>
+          <w:bCs/>
+        </w:rPr>
+        <w:t xml:space="preserve">to</w:t>
+      </w:r>
+      <w:r>
+        <w:t xml:space="preserve"> hearing </w:t>
+      </w:r>
+      <w:r>
+        <w:rPr>
+          <w:b/>
+          <w:bCs/>
+        </w:rPr>
+        <w:t xml:space="preserve">from</w:t>
+      </w:r>
+      <w:r>
+        <w:t xml:space="preserve"> you.</w:t>
+      </w:r>
+    </w:p>
+    <w:p>
+      <w:pPr>
+        <w:pBdr>
+          <w:left w:val="single" w:color="BF9000" w:sz="18" w:space="6"/>
+        </w:pBdr>
+        <w:shd w:fill="DEEAF6" w:color="auto" w:val="clear"/>
+        <w:spacing w:after="120" w:before="80"/>
+      </w:pPr>
+      <w:r>
+        <w:rPr>
+          <w:b/>
+          <w:bCs/>
+        </w:rPr>
+        <w:t xml:space="preserve">Kind regards,</w:t>
+      </w:r>
+      <w:r>
+        <w:t xml:space="preserve"> </w:t>
+      </w:r>
+      <w:r>
+        <w:rPr>
+          <w:i/>
+          <w:iCs/>
+        </w:rPr>
+        <w:t xml:space="preserve">(ou Best regards,)</w:t>
+      </w:r>
+      <w:r>
+        <w:t xml:space="preserve"> [PRÉNOM NOM] – [TÉLÉPHONE]</w:t>
+      </w:r>
+    </w:p>
+    <w:tbl>
+      <w:tblPr>
+        <w:tblW w:type="dxa" w:w="9638"/>
+        <w:tblBorders>
+          <w:top w:val="single" w:color="auto" w:sz="4"/>
+          <w:left w:val="single" w:color="auto" w:sz="4"/>
+          <w:bottom w:val="single" w:color="auto" w:sz="4"/>
+          <w:right w:val="single" w:color="auto" w:sz="4"/>
+          <w:insideH w:val="single" w:color="auto" w:sz="4"/>
+          <w:insideV w:val="single" w:color="auto" w:sz="4"/>
+        </w:tblBorders>
+      </w:tblPr>
+      <w:tblGrid>
+        <w:gridCol w:w="3855"/>
+        <w:gridCol w:w="5783"/>
+      </w:tblGrid>
+      <w:tr>
+        <w:trPr>
+          <w:tblHeader/>
+        </w:trPr>
+        <w:tc>
+          <w:tcPr>
+            <w:tcW w:type="dxa" w:w="3855"/>
+            <w:shd w:fill="1F4E79" w:color="auto" w:val="clear"/>
+            <w:tcMar>
+              <w:top w:type="dxa" w:w="60"/>
+              <w:left w:type="dxa" w:w="100"/>
+              <w:bottom w:type="dxa" w:w="60"/>
+              <w:right w:type="dxa" w:w="100"/>
+            </w:tcMar>
+          </w:tcPr>
+          <w:p>
+            <w:r>
+              <w:rPr>
+                <w:b/>
+                <w:bCs/>
+                <w:color w:val="FFFFFF"/>
+              </w:rPr>
+              <w:t xml:space="preserve">Formule de clôture</w:t>
+            </w:r>
+          </w:p>
+        </w:tc>
         <w:tc>
           <w:tcPr>
             <w:tcW w:type="dxa" w:w="5783"/>
-            <w:tcMar>
-              <w:top w:type="dxa" w:w="60"/>
-              <w:left w:type="dxa" w:w="100"/>
-              <w:bottom w:type="dxa" w:w="60"/>
-              <w:right w:type="dxa" w:w="100"/>
-            </w:tcMar>
-          </w:tcPr>
-          <w:p>
-            <w:r>
-              <w:rPr>
-                <w:b/>
-                <w:bCs/>
-              </w:rPr>
-              <w:t xml:space="preserve">Se relire</w:t>
-            </w:r>
-            <w:r>
-              <w:t xml:space="preserve"> pour la grammaire et les répétitions</w:t>
-            </w:r>
-          </w:p>
-        </w:tc>
+            <w:shd w:fill="1F4E79" w:color="auto" w:val="clear"/>
+            <w:tcMar>
+              <w:top w:type="dxa" w:w="60"/>
+              <w:left w:type="dxa" w:w="100"/>
+              <w:bottom w:type="dxa" w:w="60"/>
+              <w:right w:type="dxa" w:w="100"/>
+            </w:tcMar>
+          </w:tcPr>
+          <w:p>
+            <w:r>
+              <w:rPr>
+                <w:b/>
+                <w:bCs/>
+                <w:color w:val="FFFFFF"/>
+              </w:rPr>
+              <w:t xml:space="preserve">Quand l'utiliser</w:t>
+            </w:r>
+          </w:p>
+        </w:tc>
+      </w:tr>
+      <w:tr>
         <w:tc>
           <w:tcPr>
             <w:tcW w:type="dxa" w:w="3855"/>
@@ -4192,7 +5622,1006 @@
           </w:tcPr>
           <w:p>
             <w:r>
-              <w:t xml:space="preserve">Les critères « grammaire » et « fluidité »</w:t>
+              <w:rPr>
+                <w:b/>
+                <w:bCs/>
+              </w:rPr>
+              <w:t xml:space="preserve">Kind regards / Best regards</w:t>
+            </w:r>
+          </w:p>
+        </w:tc>
+        <w:tc>
+          <w:tcPr>
+            <w:tcW w:type="dxa" w:w="5783"/>
+            <w:tcMar>
+              <w:top w:type="dxa" w:w="60"/>
+              <w:left w:type="dxa" w:w="100"/>
+              <w:bottom w:type="dxa" w:w="60"/>
+              <w:right w:type="dxa" w:w="100"/>
+            </w:tcMar>
+          </w:tcPr>
+          <w:p>
+            <w:r>
+              <w:t xml:space="preserve">Dans un </w:t>
+            </w:r>
+            <w:r>
+              <w:rPr>
+                <w:b/>
+                <w:bCs/>
+              </w:rPr>
+              <w:t xml:space="preserve">e-mail</w:t>
+            </w:r>
+            <w:r>
+              <w:t xml:space="preserve"> (c'est ce que montrent tes notes de TD) : le choix le plus sûr pour l'examen</w:t>
+            </w:r>
+          </w:p>
+        </w:tc>
+      </w:tr>
+      <w:tr>
+        <w:tc>
+          <w:tcPr>
+            <w:tcW w:type="dxa" w:w="3855"/>
+            <w:tcMar>
+              <w:top w:type="dxa" w:w="60"/>
+              <w:left w:type="dxa" w:w="100"/>
+              <w:bottom w:type="dxa" w:w="60"/>
+              <w:right w:type="dxa" w:w="100"/>
+            </w:tcMar>
+          </w:tcPr>
+          <w:p>
+            <w:r>
+              <w:rPr>
+                <w:i/>
+                <w:iCs/>
+              </w:rPr>
+              <w:t xml:space="preserve">All the best</w:t>
+            </w:r>
+          </w:p>
+        </w:tc>
+        <w:tc>
+          <w:tcPr>
+            <w:tcW w:type="dxa" w:w="5783"/>
+            <w:tcMar>
+              <w:top w:type="dxa" w:w="60"/>
+              <w:left w:type="dxa" w:w="100"/>
+              <w:bottom w:type="dxa" w:w="60"/>
+              <w:right w:type="dxa" w:w="100"/>
+            </w:tcMar>
+          </w:tcPr>
+          <w:p>
+            <w:r>
+              <w:t xml:space="preserve">E-mail plus familier : à éviter pour une candidature</w:t>
+            </w:r>
+          </w:p>
+        </w:tc>
+      </w:tr>
+      <w:tr>
+        <w:tc>
+          <w:tcPr>
+            <w:tcW w:type="dxa" w:w="3855"/>
+            <w:tcMar>
+              <w:top w:type="dxa" w:w="60"/>
+              <w:left w:type="dxa" w:w="100"/>
+              <w:bottom w:type="dxa" w:w="60"/>
+              <w:right w:type="dxa" w:w="100"/>
+            </w:tcMar>
+          </w:tcPr>
+          <w:p>
+            <w:r>
+              <w:rPr>
+                <w:b/>
+                <w:bCs/>
+              </w:rPr>
+              <w:t xml:space="preserve">Yours sincerely</w:t>
+            </w:r>
+          </w:p>
+        </w:tc>
+        <w:tc>
+          <w:tcPr>
+            <w:tcW w:type="dxa" w:w="5783"/>
+            <w:tcMar>
+              <w:top w:type="dxa" w:w="60"/>
+              <w:left w:type="dxa" w:w="100"/>
+              <w:bottom w:type="dxa" w:w="60"/>
+              <w:right w:type="dxa" w:w="100"/>
+            </w:tcMar>
+          </w:tcPr>
+          <w:p>
+            <w:r>
+              <w:t xml:space="preserve">Lettre, quand tu connais le nom (</w:t>
+            </w:r>
+            <w:r>
+              <w:rPr>
+                <w:i/>
+                <w:iCs/>
+              </w:rPr>
+              <w:t xml:space="preserve">Dear Ms Collins</w:t>
+            </w:r>
+            <w:r>
+              <w:t xml:space="preserve">)</w:t>
+            </w:r>
+          </w:p>
+        </w:tc>
+      </w:tr>
+      <w:tr>
+        <w:tc>
+          <w:tcPr>
+            <w:tcW w:type="dxa" w:w="3855"/>
+            <w:tcMar>
+              <w:top w:type="dxa" w:w="60"/>
+              <w:left w:type="dxa" w:w="100"/>
+              <w:bottom w:type="dxa" w:w="60"/>
+              <w:right w:type="dxa" w:w="100"/>
+            </w:tcMar>
+          </w:tcPr>
+          <w:p>
+            <w:r>
+              <w:rPr>
+                <w:b/>
+                <w:bCs/>
+              </w:rPr>
+              <w:t xml:space="preserve">Yours faithfully</w:t>
+            </w:r>
+          </w:p>
+        </w:tc>
+        <w:tc>
+          <w:tcPr>
+            <w:tcW w:type="dxa" w:w="5783"/>
+            <w:tcMar>
+              <w:top w:type="dxa" w:w="60"/>
+              <w:left w:type="dxa" w:w="100"/>
+              <w:bottom w:type="dxa" w:w="60"/>
+              <w:right w:type="dxa" w:w="100"/>
+            </w:tcMar>
+          </w:tcPr>
+          <w:p>
+            <w:r>
+              <w:t xml:space="preserve">Lettre, quand tu ne connais pas le nom (</w:t>
+            </w:r>
+            <w:r>
+              <w:rPr>
+                <w:i/>
+                <w:iCs/>
+              </w:rPr>
+              <w:t xml:space="preserve">Dear Sir or Madam</w:t>
+            </w:r>
+            <w:r>
+              <w:t xml:space="preserve">)</w:t>
+            </w:r>
+          </w:p>
+        </w:tc>
+      </w:tr>
+    </w:tbl>
+    <w:p>
+      <w:pPr>
+        <w:pBdr>
+          <w:left w:val="single" w:color="BF9000" w:sz="18" w:space="6"/>
+        </w:pBdr>
+        <w:shd w:fill="FFF2CC" w:color="auto" w:val="clear"/>
+        <w:spacing w:after="120" w:before="80"/>
+      </w:pPr>
+      <w:r>
+        <w:t xml:space="preserve">⚠️ Dans tes notes, « sincere by yours » n'existe pas : c'est sans doute </w:t>
+      </w:r>
+      <w:r>
+        <w:rPr>
+          <w:i/>
+          <w:iCs/>
+        </w:rPr>
+        <w:t xml:space="preserve">Sincerely yours</w:t>
+      </w:r>
+      <w:r>
+        <w:t xml:space="preserve">, la variante américaine de </w:t>
+      </w:r>
+      <w:r>
+        <w:rPr>
+          <w:i/>
+          <w:iCs/>
+        </w:rPr>
+        <w:t xml:space="preserve">Yours sincerely</w:t>
+      </w:r>
+      <w:r>
+        <w:t xml:space="preserve">.</w:t>
+      </w:r>
+    </w:p>
+    <w:p>
+      <w:pPr>
+        <w:pStyle w:val="Heading2"/>
+        <w:spacing w:after="100" w:before="200"/>
+      </w:pPr>
+      <w:r>
+        <w:rPr>
+          <w:color w:val="1F4E79"/>
+        </w:rPr>
+        <w:t xml:space="preserve">La banque de phrases pour les preuves (§3)</w:t>
+      </w:r>
+    </w:p>
+    <w:tbl>
+      <w:tblPr>
+        <w:tblW w:type="dxa" w:w="9638"/>
+        <w:tblBorders>
+          <w:top w:val="single" w:color="auto" w:sz="4"/>
+          <w:left w:val="single" w:color="auto" w:sz="4"/>
+          <w:bottom w:val="single" w:color="auto" w:sz="4"/>
+          <w:right w:val="single" w:color="auto" w:sz="4"/>
+          <w:insideH w:val="single" w:color="auto" w:sz="4"/>
+          <w:insideV w:val="single" w:color="auto" w:sz="4"/>
+        </w:tblBorders>
+      </w:tblPr>
+      <w:tblGrid>
+        <w:gridCol w:w="2891"/>
+        <w:gridCol w:w="6747"/>
+      </w:tblGrid>
+      <w:tr>
+        <w:trPr>
+          <w:tblHeader/>
+        </w:trPr>
+        <w:tc>
+          <w:tcPr>
+            <w:tcW w:type="dxa" w:w="2891"/>
+            <w:shd w:fill="1F4E79" w:color="auto" w:val="clear"/>
+            <w:tcMar>
+              <w:top w:type="dxa" w:w="60"/>
+              <w:left w:type="dxa" w:w="100"/>
+              <w:bottom w:type="dxa" w:w="60"/>
+              <w:right w:type="dxa" w:w="100"/>
+            </w:tcMar>
+          </w:tcPr>
+          <w:p>
+            <w:r>
+              <w:rPr>
+                <w:b/>
+                <w:bCs/>
+                <w:color w:val="FFFFFF"/>
+              </w:rPr>
+              <w:t xml:space="preserve">Si l'offre demande…</w:t>
+            </w:r>
+          </w:p>
+        </w:tc>
+        <w:tc>
+          <w:tcPr>
+            <w:tcW w:type="dxa" w:w="6747"/>
+            <w:shd w:fill="1F4E79" w:color="auto" w:val="clear"/>
+            <w:tcMar>
+              <w:top w:type="dxa" w:w="60"/>
+              <w:left w:type="dxa" w:w="100"/>
+              <w:bottom w:type="dxa" w:w="60"/>
+              <w:right w:type="dxa" w:w="100"/>
+            </w:tcMar>
+          </w:tcPr>
+          <w:p>
+            <w:r>
+              <w:rPr>
+                <w:b/>
+                <w:bCs/>
+                <w:color w:val="FFFFFF"/>
+              </w:rPr>
+              <w:t xml:space="preserve">Phrase type</w:t>
+            </w:r>
+          </w:p>
+        </w:tc>
+      </w:tr>
+      <w:tr>
+        <w:tc>
+          <w:tcPr>
+            <w:tcW w:type="dxa" w:w="2891"/>
+            <w:tcMar>
+              <w:top w:type="dxa" w:w="60"/>
+              <w:left w:type="dxa" w:w="100"/>
+              <w:bottom w:type="dxa" w:w="60"/>
+              <w:right w:type="dxa" w:w="100"/>
+            </w:tcMar>
+          </w:tcPr>
+          <w:p>
+            <w:r>
+              <w:rPr>
+                <w:b/>
+                <w:bCs/>
+              </w:rPr>
+              <w:t xml:space="preserve">Relation client, communication</w:t>
+            </w:r>
+          </w:p>
+        </w:tc>
+        <w:tc>
+          <w:tcPr>
+            <w:tcW w:type="dxa" w:w="6747"/>
+            <w:tcMar>
+              <w:top w:type="dxa" w:w="60"/>
+              <w:left w:type="dxa" w:w="100"/>
+              <w:bottom w:type="dxa" w:w="60"/>
+              <w:right w:type="dxa" w:w="100"/>
+            </w:tcMar>
+          </w:tcPr>
+          <w:p>
+            <w:r>
+              <w:rPr>
+                <w:i/>
+                <w:iCs/>
+              </w:rPr>
+              <w:t xml:space="preserve">I have been working as a [JOB] at [ENTREPRISE] for [DURÉE], where I advise customers every day. This has improved my communication skills.</w:t>
+            </w:r>
+          </w:p>
+        </w:tc>
+      </w:tr>
+      <w:tr>
+        <w:tc>
+          <w:tcPr>
+            <w:tcW w:type="dxa" w:w="2891"/>
+            <w:tcMar>
+              <w:top w:type="dxa" w:w="60"/>
+              <w:left w:type="dxa" w:w="100"/>
+              <w:bottom w:type="dxa" w:w="60"/>
+              <w:right w:type="dxa" w:w="100"/>
+            </w:tcMar>
+          </w:tcPr>
+          <w:p>
+            <w:r>
+              <w:rPr>
+                <w:b/>
+                <w:bCs/>
+              </w:rPr>
+              <w:t xml:space="preserve">Travail en équipe</w:t>
+            </w:r>
+          </w:p>
+        </w:tc>
+        <w:tc>
+          <w:tcPr>
+            <w:tcW w:type="dxa" w:w="6747"/>
+            <w:tcMar>
+              <w:top w:type="dxa" w:w="60"/>
+              <w:left w:type="dxa" w:w="100"/>
+              <w:bottom w:type="dxa" w:w="60"/>
+              <w:right w:type="dxa" w:w="100"/>
+            </w:tcMar>
+          </w:tcPr>
+          <w:p>
+            <w:r>
+              <w:rPr>
+                <w:i/>
+                <w:iCs/>
+              </w:rPr>
+              <w:t xml:space="preserve">In my job at [ENTREPRISE], I work in a team of [N] people, which has taught me to be a good team player.</w:t>
+            </w:r>
+          </w:p>
+        </w:tc>
+      </w:tr>
+      <w:tr>
+        <w:tc>
+          <w:tcPr>
+            <w:tcW w:type="dxa" w:w="2891"/>
+            <w:tcMar>
+              <w:top w:type="dxa" w:w="60"/>
+              <w:left w:type="dxa" w:w="100"/>
+              <w:bottom w:type="dxa" w:w="60"/>
+              <w:right w:type="dxa" w:w="100"/>
+            </w:tcMar>
+          </w:tcPr>
+          <w:p>
+            <w:r>
+              <w:rPr>
+                <w:b/>
+                <w:bCs/>
+              </w:rPr>
+              <w:t xml:space="preserve">Réseaux sociaux, marketing</w:t>
+            </w:r>
+          </w:p>
+        </w:tc>
+        <w:tc>
+          <w:tcPr>
+            <w:tcW w:type="dxa" w:w="6747"/>
+            <w:tcMar>
+              <w:top w:type="dxa" w:w="60"/>
+              <w:left w:type="dxa" w:w="100"/>
+              <w:bottom w:type="dxa" w:w="60"/>
+              <w:right w:type="dxa" w:w="100"/>
+            </w:tcMar>
+          </w:tcPr>
+          <w:p>
+            <w:r>
+              <w:rPr>
+                <w:i/>
+                <w:iCs/>
+              </w:rPr>
+              <w:t xml:space="preserve">Last summer, I managed the Instagram account of [ASSOCIATION], and its number of followers increased by [X]%.</w:t>
+            </w:r>
+          </w:p>
+        </w:tc>
+      </w:tr>
+      <w:tr>
+        <w:tc>
+          <w:tcPr>
+            <w:tcW w:type="dxa" w:w="2891"/>
+            <w:tcMar>
+              <w:top w:type="dxa" w:w="60"/>
+              <w:left w:type="dxa" w:w="100"/>
+              <w:bottom w:type="dxa" w:w="60"/>
+              <w:right w:type="dxa" w:w="100"/>
+            </w:tcMar>
+          </w:tcPr>
+          <w:p>
+            <w:r>
+              <w:rPr>
+                <w:b/>
+                <w:bCs/>
+              </w:rPr>
+              <w:t xml:space="preserve">Organisation, gestion de projet</w:t>
+            </w:r>
+          </w:p>
+        </w:tc>
+        <w:tc>
+          <w:tcPr>
+            <w:tcW w:type="dxa" w:w="6747"/>
+            <w:tcMar>
+              <w:top w:type="dxa" w:w="60"/>
+              <w:left w:type="dxa" w:w="100"/>
+              <w:bottom w:type="dxa" w:w="60"/>
+              <w:right w:type="dxa" w:w="100"/>
+            </w:tcMar>
+          </w:tcPr>
+          <w:p>
+            <w:r>
+              <w:rPr>
+                <w:i/>
+                <w:iCs/>
+              </w:rPr>
+              <w:t xml:space="preserve">I organised [ÉVÉNEMENT] for [N] people, which required strong organisational skills.</w:t>
+            </w:r>
+          </w:p>
+        </w:tc>
+      </w:tr>
+      <w:tr>
+        <w:tc>
+          <w:tcPr>
+            <w:tcW w:type="dxa" w:w="2891"/>
+            <w:tcMar>
+              <w:top w:type="dxa" w:w="60"/>
+              <w:left w:type="dxa" w:w="100"/>
+              <w:bottom w:type="dxa" w:w="60"/>
+              <w:right w:type="dxa" w:w="100"/>
+            </w:tcMar>
+          </w:tcPr>
+          <w:p>
+            <w:r>
+              <w:rPr>
+                <w:b/>
+                <w:bCs/>
+              </w:rPr>
+              <w:t xml:space="preserve">Créativité</w:t>
+            </w:r>
+          </w:p>
+        </w:tc>
+        <w:tc>
+          <w:tcPr>
+            <w:tcW w:type="dxa" w:w="6747"/>
+            <w:tcMar>
+              <w:top w:type="dxa" w:w="60"/>
+              <w:left w:type="dxa" w:w="100"/>
+              <w:bottom w:type="dxa" w:w="60"/>
+              <w:right w:type="dxa" w:w="100"/>
+            </w:tcMar>
+          </w:tcPr>
+          <w:p>
+            <w:r>
+              <w:rPr>
+                <w:i/>
+                <w:iCs/>
+              </w:rPr>
+              <w:t xml:space="preserve">I am a creative person: [EXEMPLE CONCRET].</w:t>
+            </w:r>
+          </w:p>
+        </w:tc>
+      </w:tr>
+      <w:tr>
+        <w:tc>
+          <w:tcPr>
+            <w:tcW w:type="dxa" w:w="2891"/>
+            <w:tcMar>
+              <w:top w:type="dxa" w:w="60"/>
+              <w:left w:type="dxa" w:w="100"/>
+              <w:bottom w:type="dxa" w:w="60"/>
+              <w:right w:type="dxa" w:w="100"/>
+            </w:tcMar>
+          </w:tcPr>
+          <w:p>
+            <w:r>
+              <w:rPr>
+                <w:b/>
+                <w:bCs/>
+              </w:rPr>
+              <w:t xml:space="preserve">Analyse, études de marché</w:t>
+            </w:r>
+          </w:p>
+        </w:tc>
+        <w:tc>
+          <w:tcPr>
+            <w:tcW w:type="dxa" w:w="6747"/>
+            <w:tcMar>
+              <w:top w:type="dxa" w:w="60"/>
+              <w:left w:type="dxa" w:w="100"/>
+              <w:bottom w:type="dxa" w:w="60"/>
+              <w:right w:type="dxa" w:w="100"/>
+            </w:tcMar>
+          </w:tcPr>
+          <w:p>
+            <w:r>
+              <w:rPr>
+                <w:i/>
+                <w:iCs/>
+              </w:rPr>
+              <w:t xml:space="preserve">My management studies have given me a solid background in marketing and market research.</w:t>
+            </w:r>
+          </w:p>
+        </w:tc>
+      </w:tr>
+      <w:tr>
+        <w:tc>
+          <w:tcPr>
+            <w:tcW w:type="dxa" w:w="2891"/>
+            <w:tcMar>
+              <w:top w:type="dxa" w:w="60"/>
+              <w:left w:type="dxa" w:w="100"/>
+              <w:bottom w:type="dxa" w:w="60"/>
+              <w:right w:type="dxa" w:w="100"/>
+            </w:tcMar>
+          </w:tcPr>
+          <w:p>
+            <w:r>
+              <w:rPr>
+                <w:b/>
+                <w:bCs/>
+              </w:rPr>
+              <w:t xml:space="preserve">Rigueur, gestion</w:t>
+            </w:r>
+          </w:p>
+        </w:tc>
+        <w:tc>
+          <w:tcPr>
+            <w:tcW w:type="dxa" w:w="6747"/>
+            <w:tcMar>
+              <w:top w:type="dxa" w:w="60"/>
+              <w:left w:type="dxa" w:w="100"/>
+              <w:bottom w:type="dxa" w:w="60"/>
+              <w:right w:type="dxa" w:w="100"/>
+            </w:tcMar>
+          </w:tcPr>
+          <w:p>
+            <w:r>
+              <w:rPr>
+                <w:i/>
+                <w:iCs/>
+              </w:rPr>
+              <w:t xml:space="preserve">I am in charge of [TÂCHE] at [ENTREPRISE], which requires accuracy and reliability.</w:t>
+            </w:r>
+          </w:p>
+        </w:tc>
+      </w:tr>
+    </w:tbl>
+    <w:p>
+      <w:pPr>
+        <w:pStyle w:val="Heading2"/>
+        <w:spacing w:after="100" w:before="200"/>
+      </w:pPr>
+      <w:r>
+        <w:rPr>
+          <w:color w:val="1F4E79"/>
+        </w:rPr>
+        <w:t xml:space="preserve">Exemple rempli : Tom Bernard, stage marketing chez GreenWear</w:t>
+      </w:r>
+    </w:p>
+    <w:p>
+      <w:pPr>
+        <w:pBdr>
+          <w:left w:val="single" w:color="BF9000" w:sz="18" w:space="6"/>
+        </w:pBdr>
+        <w:shd w:fill="DEEAF6" w:color="auto" w:val="clear"/>
+        <w:spacing w:after="120" w:before="80"/>
+      </w:pPr>
+      <w:r>
+        <w:rPr>
+          <w:i/>
+          <w:iCs/>
+        </w:rPr>
+        <w:t xml:space="preserve">Subject: Application for the Marketing Intern position – Tom Bernard</w:t>
+      </w:r>
+    </w:p>
+    <w:p>
+      <w:pPr>
+        <w:pBdr>
+          <w:left w:val="single" w:color="BF9000" w:sz="18" w:space="6"/>
+        </w:pBdr>
+        <w:shd w:fill="DEEAF6" w:color="auto" w:val="clear"/>
+        <w:spacing w:after="120" w:before="80"/>
+      </w:pPr>
+      <w:r>
+        <w:rPr>
+          <w:i/>
+          <w:iCs/>
+        </w:rPr>
+        <w:t xml:space="preserve">Dear Ms Collins,</w:t>
+      </w:r>
+    </w:p>
+    <w:p>
+      <w:pPr>
+        <w:pBdr>
+          <w:left w:val="single" w:color="BF9000" w:sz="18" w:space="6"/>
+        </w:pBdr>
+        <w:shd w:fill="DEEAF6" w:color="auto" w:val="clear"/>
+        <w:spacing w:after="120" w:before="80"/>
+      </w:pPr>
+      <w:r>
+        <w:rPr>
+          <w:i/>
+          <w:iCs/>
+        </w:rPr>
+        <w:t xml:space="preserve">I am writing to apply for the position of Marketing Intern advertised on your website. I am currently in the second year of a bachelor's degree in management at IAE Lyon.</w:t>
+      </w:r>
+    </w:p>
+    <w:p>
+      <w:pPr>
+        <w:pBdr>
+          <w:left w:val="single" w:color="BF9000" w:sz="18" w:space="6"/>
+        </w:pBdr>
+        <w:shd w:fill="DEEAF6" w:color="auto" w:val="clear"/>
+        <w:spacing w:after="120" w:before="80"/>
+      </w:pPr>
+      <w:r>
+        <w:rPr>
+          <w:i/>
+          <w:iCs/>
+        </w:rPr>
+        <w:t xml:space="preserve">I am particularly interested in GreenWear because I share your commitment to eco-friendly fashion. I would be delighted to contribute to your team.</w:t>
+      </w:r>
+    </w:p>
+    <w:p>
+      <w:pPr>
+        <w:pBdr>
+          <w:left w:val="single" w:color="BF9000" w:sz="18" w:space="6"/>
+        </w:pBdr>
+        <w:shd w:fill="DEEAF6" w:color="auto" w:val="clear"/>
+        <w:spacing w:after="120" w:before="80"/>
+      </w:pPr>
+      <w:r>
+        <w:rPr>
+          <w:i/>
+          <w:iCs/>
+        </w:rPr>
+        <w:t xml:space="preserve">I believe my profile matches your requirements. Last summer, I managed the Instagram account of a student association, and its number of followers increased by 40% in two months. I have also been working as a sales assistant at Decathlon since September 2025, where I work in a team of eight people. In addition, I am proficient in Canva and PowerPoint, and my English is at a B2 level.</w:t>
+      </w:r>
+    </w:p>
+    <w:p>
+      <w:pPr>
+        <w:pBdr>
+          <w:left w:val="single" w:color="BF9000" w:sz="18" w:space="6"/>
+        </w:pBdr>
+        <w:shd w:fill="DEEAF6" w:color="auto" w:val="clear"/>
+        <w:spacing w:after="120" w:before="80"/>
+      </w:pPr>
+      <w:r>
+        <w:rPr>
+          <w:i/>
+          <w:iCs/>
+        </w:rPr>
+        <w:t xml:space="preserve">I am available from June to August 2027. Please find my CV attached. I would welcome the opportunity to discuss my application at an interview. I look forward to hearing from you.</w:t>
+      </w:r>
+    </w:p>
+    <w:p>
+      <w:pPr>
+        <w:pBdr>
+          <w:left w:val="single" w:color="BF9000" w:sz="18" w:space="6"/>
+        </w:pBdr>
+        <w:shd w:fill="DEEAF6" w:color="auto" w:val="clear"/>
+        <w:spacing w:after="120" w:before="80"/>
+      </w:pPr>
+      <w:r>
+        <w:rPr>
+          <w:i/>
+          <w:iCs/>
+        </w:rPr>
+        <w:t xml:space="preserve">Kind regards,</w:t>
+      </w:r>
+      <w:r>
+        <w:t xml:space="preserve"> </w:t>
+      </w:r>
+      <w:r>
+        <w:rPr>
+          <w:i/>
+          <w:iCs/>
+        </w:rPr>
+        <w:t xml:space="preserve">Tom Bernard – +33 6 12 34 56 78</w:t>
+      </w:r>
+    </w:p>
+    <w:p>
+      <w:pPr>
+        <w:spacing w:after="100"/>
+      </w:pPr>
+      <w:r>
+        <w:rPr>
+          <w:b/>
+          <w:bCs/>
+        </w:rPr>
+        <w:t xml:space="preserve">Laissé de côté :</w:t>
+      </w:r>
+      <w:r>
+        <w:t xml:space="preserve"> l'espagnol, la course à pied, le baccalauréat, Word et Excel, parce que l'offre ne les demande pas. </w:t>
+      </w:r>
+      <w:r>
+        <w:rPr>
+          <w:b/>
+          <w:bCs/>
+        </w:rPr>
+        <w:t xml:space="preserve">Mis en avant :</w:t>
+      </w:r>
+      <w:r>
+        <w:t xml:space="preserve"> Instagram, l'esprit d'équipe, Canva et PowerPoint, l'anglais B2, la mode.</w:t>
+      </w:r>
+    </w:p>
+    <w:p>
+      <w:pPr>
+        <w:pStyle w:val="Heading2"/>
+        <w:spacing w:after="100" w:before="200"/>
+      </w:pPr>
+      <w:r>
+        <w:rPr>
+          <w:color w:val="1F4E79"/>
+        </w:rPr>
+        <w:t xml:space="preserve">Le jour de l'examen, en 4 étapes (environ 20 minutes)</w:t>
+      </w:r>
+    </w:p>
+    <w:tbl>
+      <w:tblPr>
+        <w:tblW w:type="dxa" w:w="9638"/>
+        <w:tblBorders>
+          <w:top w:val="single" w:color="auto" w:sz="4"/>
+          <w:left w:val="single" w:color="auto" w:sz="4"/>
+          <w:bottom w:val="single" w:color="auto" w:sz="4"/>
+          <w:right w:val="single" w:color="auto" w:sz="4"/>
+          <w:insideH w:val="single" w:color="auto" w:sz="4"/>
+          <w:insideV w:val="single" w:color="auto" w:sz="4"/>
+        </w:tblBorders>
+      </w:tblPr>
+      <w:tblGrid>
+        <w:gridCol w:w="7710"/>
+        <w:gridCol w:w="1928"/>
+      </w:tblGrid>
+      <w:tr>
+        <w:trPr>
+          <w:tblHeader/>
+        </w:trPr>
+        <w:tc>
+          <w:tcPr>
+            <w:tcW w:type="dxa" w:w="7710"/>
+            <w:shd w:fill="1F4E79" w:color="auto" w:val="clear"/>
+            <w:tcMar>
+              <w:top w:type="dxa" w:w="60"/>
+              <w:left w:type="dxa" w:w="100"/>
+              <w:bottom w:type="dxa" w:w="60"/>
+              <w:right w:type="dxa" w:w="100"/>
+            </w:tcMar>
+          </w:tcPr>
+          <w:p>
+            <w:r>
+              <w:rPr>
+                <w:b/>
+                <w:bCs/>
+                <w:color w:val="FFFFFF"/>
+              </w:rPr>
+              <w:t xml:space="preserve">Étape</w:t>
+            </w:r>
+          </w:p>
+        </w:tc>
+        <w:tc>
+          <w:tcPr>
+            <w:tcW w:type="dxa" w:w="1928"/>
+            <w:shd w:fill="1F4E79" w:color="auto" w:val="clear"/>
+            <w:tcMar>
+              <w:top w:type="dxa" w:w="60"/>
+              <w:left w:type="dxa" w:w="100"/>
+              <w:bottom w:type="dxa" w:w="60"/>
+              <w:right w:type="dxa" w:w="100"/>
+            </w:tcMar>
+          </w:tcPr>
+          <w:p>
+            <w:r>
+              <w:rPr>
+                <w:b/>
+                <w:bCs/>
+                <w:color w:val="FFFFFF"/>
+              </w:rPr>
+              <w:t xml:space="preserve">Durée</w:t>
+            </w:r>
+          </w:p>
+        </w:tc>
+      </w:tr>
+      <w:tr>
+        <w:tc>
+          <w:tcPr>
+            <w:tcW w:type="dxa" w:w="7710"/>
+            <w:tcMar>
+              <w:top w:type="dxa" w:w="60"/>
+              <w:left w:type="dxa" w:w="100"/>
+              <w:bottom w:type="dxa" w:w="60"/>
+              <w:right w:type="dxa" w:w="100"/>
+            </w:tcMar>
+          </w:tcPr>
+          <w:p>
+            <w:r>
+              <w:rPr>
+                <w:b/>
+                <w:bCs/>
+              </w:rPr>
+              <w:t xml:space="preserve">1.</w:t>
+            </w:r>
+            <w:r>
+              <w:t xml:space="preserve"> Surligner les exigences de l'offre</w:t>
+            </w:r>
+          </w:p>
+        </w:tc>
+        <w:tc>
+          <w:tcPr>
+            <w:tcW w:type="dxa" w:w="1928"/>
+            <w:tcMar>
+              <w:top w:type="dxa" w:w="60"/>
+              <w:left w:type="dxa" w:w="100"/>
+              <w:bottom w:type="dxa" w:w="60"/>
+              <w:right w:type="dxa" w:w="100"/>
+            </w:tcMar>
+          </w:tcPr>
+          <w:p>
+            <w:r>
+              <w:t xml:space="preserve">3 min</w:t>
+            </w:r>
+          </w:p>
+        </w:tc>
+      </w:tr>
+      <w:tr>
+        <w:tc>
+          <w:tcPr>
+            <w:tcW w:type="dxa" w:w="7710"/>
+            <w:tcMar>
+              <w:top w:type="dxa" w:w="60"/>
+              <w:left w:type="dxa" w:w="100"/>
+              <w:bottom w:type="dxa" w:w="60"/>
+              <w:right w:type="dxa" w:w="100"/>
+            </w:tcMar>
+          </w:tcPr>
+          <w:p>
+            <w:r>
+              <w:rPr>
+                <w:b/>
+                <w:bCs/>
+              </w:rPr>
+              <w:t xml:space="preserve">2.</w:t>
+            </w:r>
+            <w:r>
+              <w:t xml:space="preserve"> Trouver dans le CV une preuve pour 2 ou 3 d'entre elles</w:t>
+            </w:r>
+          </w:p>
+        </w:tc>
+        <w:tc>
+          <w:tcPr>
+            <w:tcW w:type="dxa" w:w="1928"/>
+            <w:tcMar>
+              <w:top w:type="dxa" w:w="60"/>
+              <w:left w:type="dxa" w:w="100"/>
+              <w:bottom w:type="dxa" w:w="60"/>
+              <w:right w:type="dxa" w:w="100"/>
+            </w:tcMar>
+          </w:tcPr>
+          <w:p>
+            <w:r>
+              <w:t xml:space="preserve">3 min</w:t>
+            </w:r>
+          </w:p>
+        </w:tc>
+      </w:tr>
+      <w:tr>
+        <w:tc>
+          <w:tcPr>
+            <w:tcW w:type="dxa" w:w="7710"/>
+            <w:tcMar>
+              <w:top w:type="dxa" w:w="60"/>
+              <w:left w:type="dxa" w:w="100"/>
+              <w:bottom w:type="dxa" w:w="60"/>
+              <w:right w:type="dxa" w:w="100"/>
+            </w:tcMar>
+          </w:tcPr>
+          <w:p>
+            <w:r>
+              <w:rPr>
+                <w:b/>
+                <w:bCs/>
+              </w:rPr>
+              <w:t xml:space="preserve">3.</w:t>
+            </w:r>
+            <w:r>
+              <w:t xml:space="preserve"> Remplir le modèle</w:t>
+            </w:r>
+          </w:p>
+        </w:tc>
+        <w:tc>
+          <w:tcPr>
+            <w:tcW w:type="dxa" w:w="1928"/>
+            <w:tcMar>
+              <w:top w:type="dxa" w:w="60"/>
+              <w:left w:type="dxa" w:w="100"/>
+              <w:bottom w:type="dxa" w:w="60"/>
+              <w:right w:type="dxa" w:w="100"/>
+            </w:tcMar>
+          </w:tcPr>
+          <w:p>
+            <w:r>
+              <w:t xml:space="preserve">10 min</w:t>
+            </w:r>
+          </w:p>
+        </w:tc>
+      </w:tr>
+      <w:tr>
+        <w:tc>
+          <w:tcPr>
+            <w:tcW w:type="dxa" w:w="7710"/>
+            <w:tcMar>
+              <w:top w:type="dxa" w:w="60"/>
+              <w:left w:type="dxa" w:w="100"/>
+              <w:bottom w:type="dxa" w:w="60"/>
+              <w:right w:type="dxa" w:w="100"/>
+            </w:tcMar>
+          </w:tcPr>
+          <w:p>
+            <w:r>
+              <w:rPr>
+                <w:b/>
+                <w:bCs/>
+              </w:rPr>
+              <w:t xml:space="preserve">4.</w:t>
+            </w:r>
+            <w:r>
+              <w:t xml:space="preserve"> Se relire : </w:t>
+            </w:r>
+            <w:r>
+              <w:rPr>
+                <w:i/>
+                <w:iCs/>
+              </w:rPr>
+              <w:t xml:space="preserve">who</w:t>
+            </w:r>
+            <w:r>
+              <w:t xml:space="preserve">, le -s de la 3ᵉ personne, </w:t>
+            </w:r>
+            <w:r>
+              <w:rPr>
+                <w:i/>
+                <w:iCs/>
+              </w:rPr>
+              <w:t xml:space="preserve">for</w:t>
+            </w:r>
+            <w:r>
+              <w:t xml:space="preserve"> ou </w:t>
+            </w:r>
+            <w:r>
+              <w:rPr>
+                <w:i/>
+                <w:iCs/>
+              </w:rPr>
+              <w:t xml:space="preserve">since</w:t>
+            </w:r>
+            <w:r>
+              <w:t xml:space="preserve">, les articles, les répétitions</w:t>
+            </w:r>
+          </w:p>
+        </w:tc>
+        <w:tc>
+          <w:tcPr>
+            <w:tcW w:type="dxa" w:w="1928"/>
+            <w:tcMar>
+              <w:top w:type="dxa" w:w="60"/>
+              <w:left w:type="dxa" w:w="100"/>
+              <w:bottom w:type="dxa" w:w="60"/>
+              <w:right w:type="dxa" w:w="100"/>
+            </w:tcMar>
+          </w:tcPr>
+          <w:p>
+            <w:r>
+              <w:t xml:space="preserve">4 min</w:t>
             </w:r>
           </w:p>
         </w:tc>

</xml_diff>

<commit_message>
Add LinkedIn post vocabulary (exercise 3.1) to English revision sheet
Co-Authored-By: Claude Opus 5.5 <noreply@anthropic.com>
Claude-Session: https://claude.ai/code/session_01SxCGvMisV1WyaExPLPSBu2
</commit_message>
<xml_diff>
--- a/Fiche_reflexes_anglais.docx
+++ b/Fiche_reflexes_anglais.docx
@@ -977,6 +977,777 @@
         </w:tc>
       </w:tr>
     </w:tbl>
+    <w:p>
+      <w:pPr>
+        <w:pStyle w:val="Heading2"/>
+        <w:spacing w:after="100" w:before="200"/>
+      </w:pPr>
+      <w:r>
+        <w:rPr>
+          <w:color w:val="1F4E79"/>
+        </w:rPr>
+        <w:t xml:space="preserve">Le post LinkedIn de Maria (exercice 3.1, annoncé pour l'examen)</w:t>
+      </w:r>
+    </w:p>
+    <w:p>
+      <w:pPr>
+        <w:pBdr>
+          <w:left w:val="single" w:color="BF9000" w:sz="18" w:space="6"/>
+        </w:pBdr>
+        <w:shd w:fill="FFF2CC" w:color="auto" w:val="clear"/>
+        <w:spacing w:after="120" w:before="80"/>
+      </w:pPr>
+      <w:r>
+        <w:t xml:space="preserve">📢 La professeure a envoyé le corrigé de cet exercice en précisant que </w:t>
+      </w:r>
+      <w:r>
+        <w:rPr>
+          <w:b/>
+          <w:bCs/>
+        </w:rPr>
+        <w:t xml:space="preserve">ses éléments peuvent figurer dans l'examen</w:t>
+      </w:r>
+      <w:r>
+        <w:t xml:space="preserve"> : ces mots sont de très bons candidats pour la partie Vocabulary.</w:t>
+      </w:r>
+    </w:p>
+    <w:tbl>
+      <w:tblPr>
+        <w:tblW w:type="dxa" w:w="9638"/>
+        <w:tblBorders>
+          <w:top w:val="single" w:color="auto" w:sz="4"/>
+          <w:left w:val="single" w:color="auto" w:sz="4"/>
+          <w:bottom w:val="single" w:color="auto" w:sz="4"/>
+          <w:right w:val="single" w:color="auto" w:sz="4"/>
+          <w:insideH w:val="single" w:color="auto" w:sz="4"/>
+          <w:insideV w:val="single" w:color="auto" w:sz="4"/>
+        </w:tblBorders>
+      </w:tblPr>
+      <w:tblGrid>
+        <w:gridCol w:w="2891"/>
+        <w:gridCol w:w="6747"/>
+      </w:tblGrid>
+      <w:tr>
+        <w:trPr>
+          <w:tblHeader/>
+        </w:trPr>
+        <w:tc>
+          <w:tcPr>
+            <w:tcW w:type="dxa" w:w="2891"/>
+            <w:shd w:fill="1F4E79" w:color="auto" w:val="clear"/>
+            <w:tcMar>
+              <w:top w:type="dxa" w:w="60"/>
+              <w:left w:type="dxa" w:w="100"/>
+              <w:bottom w:type="dxa" w:w="60"/>
+              <w:right w:type="dxa" w:w="100"/>
+            </w:tcMar>
+          </w:tcPr>
+          <w:p>
+            <w:r>
+              <w:rPr>
+                <w:b/>
+                <w:bCs/>
+                <w:color w:val="FFFFFF"/>
+              </w:rPr>
+              <w:t xml:space="preserve">Mot</w:t>
+            </w:r>
+          </w:p>
+        </w:tc>
+        <w:tc>
+          <w:tcPr>
+            <w:tcW w:type="dxa" w:w="6747"/>
+            <w:shd w:fill="1F4E79" w:color="auto" w:val="clear"/>
+            <w:tcMar>
+              <w:top w:type="dxa" w:w="60"/>
+              <w:left w:type="dxa" w:w="100"/>
+              <w:bottom w:type="dxa" w:w="60"/>
+              <w:right w:type="dxa" w:w="100"/>
+            </w:tcMar>
+          </w:tcPr>
+          <w:p>
+            <w:r>
+              <w:rPr>
+                <w:b/>
+                <w:bCs/>
+                <w:color w:val="FFFFFF"/>
+              </w:rPr>
+              <w:t xml:space="preserve">Définition modèle</w:t>
+            </w:r>
+          </w:p>
+        </w:tc>
+      </w:tr>
+      <w:tr>
+        <w:tc>
+          <w:tcPr>
+            <w:tcW w:type="dxa" w:w="2891"/>
+            <w:tcMar>
+              <w:top w:type="dxa" w:w="60"/>
+              <w:left w:type="dxa" w:w="100"/>
+              <w:bottom w:type="dxa" w:w="60"/>
+              <w:right w:type="dxa" w:w="100"/>
+            </w:tcMar>
+          </w:tcPr>
+          <w:p>
+            <w:r>
+              <w:rPr>
+                <w:b/>
+                <w:bCs/>
+              </w:rPr>
+              <w:t xml:space="preserve">dedicated</w:t>
+            </w:r>
+            <w:r>
+              <w:t xml:space="preserve"> ⭐</w:t>
+            </w:r>
+          </w:p>
+        </w:tc>
+        <w:tc>
+          <w:tcPr>
+            <w:tcW w:type="dxa" w:w="6747"/>
+            <w:tcMar>
+              <w:top w:type="dxa" w:w="60"/>
+              <w:left w:type="dxa" w:w="100"/>
+              <w:bottom w:type="dxa" w:w="60"/>
+              <w:right w:type="dxa" w:w="100"/>
+            </w:tcMar>
+          </w:tcPr>
+          <w:p>
+            <w:r>
+              <w:t xml:space="preserve">describes a person who works hard and is fully committed to their job or to a goal.</w:t>
+            </w:r>
+          </w:p>
+        </w:tc>
+      </w:tr>
+      <w:tr>
+        <w:tc>
+          <w:tcPr>
+            <w:tcW w:type="dxa" w:w="2891"/>
+            <w:tcMar>
+              <w:top w:type="dxa" w:w="60"/>
+              <w:left w:type="dxa" w:w="100"/>
+              <w:bottom w:type="dxa" w:w="60"/>
+              <w:right w:type="dxa" w:w="100"/>
+            </w:tcMar>
+          </w:tcPr>
+          <w:p>
+            <w:r>
+              <w:rPr>
+                <w:b/>
+                <w:bCs/>
+              </w:rPr>
+              <w:t xml:space="preserve">commitment</w:t>
+            </w:r>
+            <w:r>
+              <w:t xml:space="preserve"> ⭐</w:t>
+            </w:r>
+          </w:p>
+        </w:tc>
+        <w:tc>
+          <w:tcPr>
+            <w:tcW w:type="dxa" w:w="6747"/>
+            <w:tcMar>
+              <w:top w:type="dxa" w:w="60"/>
+              <w:left w:type="dxa" w:w="100"/>
+              <w:bottom w:type="dxa" w:w="60"/>
+              <w:right w:type="dxa" w:w="100"/>
+            </w:tcMar>
+          </w:tcPr>
+          <w:p>
+            <w:r>
+              <w:t xml:space="preserve">the willingness to give a lot of time and energy to a job, an activity or a goal.</w:t>
+            </w:r>
+          </w:p>
+        </w:tc>
+      </w:tr>
+      <w:tr>
+        <w:tc>
+          <w:tcPr>
+            <w:tcW w:type="dxa" w:w="2891"/>
+            <w:tcMar>
+              <w:top w:type="dxa" w:w="60"/>
+              <w:left w:type="dxa" w:w="100"/>
+              <w:bottom w:type="dxa" w:w="60"/>
+              <w:right w:type="dxa" w:w="100"/>
+            </w:tcMar>
+          </w:tcPr>
+          <w:p>
+            <w:r>
+              <w:rPr>
+                <w:b/>
+                <w:bCs/>
+              </w:rPr>
+              <w:t xml:space="preserve">comprehensive</w:t>
+            </w:r>
+            <w:r>
+              <w:t xml:space="preserve"> ⭐</w:t>
+            </w:r>
+          </w:p>
+        </w:tc>
+        <w:tc>
+          <w:tcPr>
+            <w:tcW w:type="dxa" w:w="6747"/>
+            <w:tcMar>
+              <w:top w:type="dxa" w:w="60"/>
+              <w:left w:type="dxa" w:w="100"/>
+              <w:bottom w:type="dxa" w:w="60"/>
+              <w:right w:type="dxa" w:w="100"/>
+            </w:tcMar>
+          </w:tcPr>
+          <w:p>
+            <w:r>
+              <w:t xml:space="preserve">describes something that is complete and includes all or nearly all the necessary elements, e.g. a comprehensive course.</w:t>
+            </w:r>
+          </w:p>
+        </w:tc>
+      </w:tr>
+      <w:tr>
+        <w:tc>
+          <w:tcPr>
+            <w:tcW w:type="dxa" w:w="2891"/>
+            <w:tcMar>
+              <w:top w:type="dxa" w:w="60"/>
+              <w:left w:type="dxa" w:w="100"/>
+              <w:bottom w:type="dxa" w:w="60"/>
+              <w:right w:type="dxa" w:w="100"/>
+            </w:tcMar>
+          </w:tcPr>
+          <w:p>
+            <w:r>
+              <w:rPr>
+                <w:b/>
+                <w:bCs/>
+              </w:rPr>
+              <w:t xml:space="preserve">stakeholders</w:t>
+            </w:r>
+            <w:r>
+              <w:t xml:space="preserve"> ⭐</w:t>
+            </w:r>
+          </w:p>
+        </w:tc>
+        <w:tc>
+          <w:tcPr>
+            <w:tcW w:type="dxa" w:w="6747"/>
+            <w:tcMar>
+              <w:top w:type="dxa" w:w="60"/>
+              <w:left w:type="dxa" w:w="100"/>
+              <w:bottom w:type="dxa" w:w="60"/>
+              <w:right w:type="dxa" w:w="100"/>
+            </w:tcMar>
+          </w:tcPr>
+          <w:p>
+            <w:r>
+              <w:t xml:space="preserve">people or groups who are interested in or affected by a company's activities, such as employees, customers, shareholders or suppliers.</w:t>
+            </w:r>
+          </w:p>
+        </w:tc>
+      </w:tr>
+      <w:tr>
+        <w:tc>
+          <w:tcPr>
+            <w:tcW w:type="dxa" w:w="2891"/>
+            <w:tcMar>
+              <w:top w:type="dxa" w:w="60"/>
+              <w:left w:type="dxa" w:w="100"/>
+              <w:bottom w:type="dxa" w:w="60"/>
+              <w:right w:type="dxa" w:w="100"/>
+            </w:tcMar>
+          </w:tcPr>
+          <w:p>
+            <w:r>
+              <w:rPr>
+                <w:b/>
+                <w:bCs/>
+              </w:rPr>
+              <w:t xml:space="preserve">start-up</w:t>
+            </w:r>
+            <w:r>
+              <w:t xml:space="preserve"> ⭐</w:t>
+            </w:r>
+          </w:p>
+        </w:tc>
+        <w:tc>
+          <w:tcPr>
+            <w:tcW w:type="dxa" w:w="6747"/>
+            <w:tcMar>
+              <w:top w:type="dxa" w:w="60"/>
+              <w:left w:type="dxa" w:w="100"/>
+              <w:bottom w:type="dxa" w:w="60"/>
+              <w:right w:type="dxa" w:w="100"/>
+            </w:tcMar>
+          </w:tcPr>
+          <w:p>
+            <w:r>
+              <w:t xml:space="preserve">a newly created, often innovative, small company that is trying to develop and grow.</w:t>
+            </w:r>
+          </w:p>
+        </w:tc>
+      </w:tr>
+      <w:tr>
+        <w:tc>
+          <w:tcPr>
+            <w:tcW w:type="dxa" w:w="2891"/>
+            <w:tcMar>
+              <w:top w:type="dxa" w:w="60"/>
+              <w:left w:type="dxa" w:w="100"/>
+              <w:bottom w:type="dxa" w:w="60"/>
+              <w:right w:type="dxa" w:w="100"/>
+            </w:tcMar>
+          </w:tcPr>
+          <w:p>
+            <w:r>
+              <w:rPr>
+                <w:b/>
+                <w:bCs/>
+              </w:rPr>
+              <w:t xml:space="preserve">to hone</w:t>
+            </w:r>
+            <w:r>
+              <w:t xml:space="preserve"> ⭐</w:t>
+            </w:r>
+          </w:p>
+        </w:tc>
+        <w:tc>
+          <w:tcPr>
+            <w:tcW w:type="dxa" w:w="6747"/>
+            <w:tcMar>
+              <w:top w:type="dxa" w:w="60"/>
+              <w:left w:type="dxa" w:w="100"/>
+              <w:bottom w:type="dxa" w:w="60"/>
+              <w:right w:type="dxa" w:w="100"/>
+            </w:tcMar>
+          </w:tcPr>
+          <w:p>
+            <w:r>
+              <w:t xml:space="preserve">to improve a skill over time through practice, until it becomes very good.</w:t>
+            </w:r>
+          </w:p>
+        </w:tc>
+      </w:tr>
+      <w:tr>
+        <w:tc>
+          <w:tcPr>
+            <w:tcW w:type="dxa" w:w="2891"/>
+            <w:tcMar>
+              <w:top w:type="dxa" w:w="60"/>
+              <w:left w:type="dxa" w:w="100"/>
+              <w:bottom w:type="dxa" w:w="60"/>
+              <w:right w:type="dxa" w:w="100"/>
+            </w:tcMar>
+          </w:tcPr>
+          <w:p>
+            <w:r>
+              <w:rPr>
+                <w:b/>
+                <w:bCs/>
+              </w:rPr>
+              <w:t xml:space="preserve">eager</w:t>
+            </w:r>
+            <w:r>
+              <w:t xml:space="preserve"> ⭐</w:t>
+            </w:r>
+          </w:p>
+        </w:tc>
+        <w:tc>
+          <w:tcPr>
+            <w:tcW w:type="dxa" w:w="6747"/>
+            <w:tcMar>
+              <w:top w:type="dxa" w:w="60"/>
+              <w:left w:type="dxa" w:w="100"/>
+              <w:bottom w:type="dxa" w:w="60"/>
+              <w:right w:type="dxa" w:w="100"/>
+            </w:tcMar>
+          </w:tcPr>
+          <w:p>
+            <w:r>
+              <w:t xml:space="preserve">describes a person who really wants to do something and is enthusiastic about it.</w:t>
+            </w:r>
+          </w:p>
+        </w:tc>
+      </w:tr>
+      <w:tr>
+        <w:tc>
+          <w:tcPr>
+            <w:tcW w:type="dxa" w:w="2891"/>
+            <w:tcMar>
+              <w:top w:type="dxa" w:w="60"/>
+              <w:left w:type="dxa" w:w="100"/>
+              <w:bottom w:type="dxa" w:w="60"/>
+              <w:right w:type="dxa" w:w="100"/>
+            </w:tcMar>
+          </w:tcPr>
+          <w:p>
+            <w:r>
+              <w:rPr>
+                <w:b/>
+                <w:bCs/>
+              </w:rPr>
+              <w:t xml:space="preserve">to seek</w:t>
+            </w:r>
+          </w:p>
+        </w:tc>
+        <w:tc>
+          <w:tcPr>
+            <w:tcW w:type="dxa" w:w="6747"/>
+            <w:tcMar>
+              <w:top w:type="dxa" w:w="60"/>
+              <w:left w:type="dxa" w:w="100"/>
+              <w:bottom w:type="dxa" w:w="60"/>
+              <w:right w:type="dxa" w:w="100"/>
+            </w:tcMar>
+          </w:tcPr>
+          <w:p>
+            <w:r>
+              <w:t xml:space="preserve">to try to find or obtain something, such as a job or an internship.</w:t>
+            </w:r>
+          </w:p>
+        </w:tc>
+      </w:tr>
+      <w:tr>
+        <w:tc>
+          <w:tcPr>
+            <w:tcW w:type="dxa" w:w="2891"/>
+            <w:tcMar>
+              <w:top w:type="dxa" w:w="60"/>
+              <w:left w:type="dxa" w:w="100"/>
+              <w:bottom w:type="dxa" w:w="60"/>
+              <w:right w:type="dxa" w:w="100"/>
+            </w:tcMar>
+          </w:tcPr>
+          <w:p>
+            <w:r>
+              <w:rPr>
+                <w:b/>
+                <w:bCs/>
+              </w:rPr>
+              <w:t xml:space="preserve">involved</w:t>
+            </w:r>
+          </w:p>
+        </w:tc>
+        <w:tc>
+          <w:tcPr>
+            <w:tcW w:type="dxa" w:w="6747"/>
+            <w:tcMar>
+              <w:top w:type="dxa" w:w="60"/>
+              <w:left w:type="dxa" w:w="100"/>
+              <w:bottom w:type="dxa" w:w="60"/>
+              <w:right w:type="dxa" w:w="100"/>
+            </w:tcMar>
+          </w:tcPr>
+          <w:p>
+            <w:r>
+              <w:t xml:space="preserve">describes a person who takes an active part in an activity or a project.</w:t>
+            </w:r>
+          </w:p>
+        </w:tc>
+      </w:tr>
+      <w:tr>
+        <w:tc>
+          <w:tcPr>
+            <w:tcW w:type="dxa" w:w="2891"/>
+            <w:tcMar>
+              <w:top w:type="dxa" w:w="60"/>
+              <w:left w:type="dxa" w:w="100"/>
+              <w:bottom w:type="dxa" w:w="60"/>
+              <w:right w:type="dxa" w:w="100"/>
+            </w:tcMar>
+          </w:tcPr>
+          <w:p>
+            <w:r>
+              <w:rPr>
+                <w:b/>
+                <w:bCs/>
+              </w:rPr>
+              <w:t xml:space="preserve">practical</w:t>
+            </w:r>
+          </w:p>
+        </w:tc>
+        <w:tc>
+          <w:tcPr>
+            <w:tcW w:type="dxa" w:w="6747"/>
+            <w:tcMar>
+              <w:top w:type="dxa" w:w="60"/>
+              <w:left w:type="dxa" w:w="100"/>
+              <w:bottom w:type="dxa" w:w="60"/>
+              <w:right w:type="dxa" w:w="100"/>
+            </w:tcMar>
+          </w:tcPr>
+          <w:p>
+            <w:r>
+              <w:t xml:space="preserve">relating to real situations and actions rather than to theory.</w:t>
+            </w:r>
+          </w:p>
+        </w:tc>
+      </w:tr>
+      <w:tr>
+        <w:tc>
+          <w:tcPr>
+            <w:tcW w:type="dxa" w:w="2891"/>
+            <w:tcMar>
+              <w:top w:type="dxa" w:w="60"/>
+              <w:left w:type="dxa" w:w="100"/>
+              <w:bottom w:type="dxa" w:w="60"/>
+              <w:right w:type="dxa" w:w="100"/>
+            </w:tcMar>
+          </w:tcPr>
+          <w:p>
+            <w:r>
+              <w:rPr>
+                <w:b/>
+                <w:bCs/>
+              </w:rPr>
+              <w:t xml:space="preserve">to intern</w:t>
+            </w:r>
+          </w:p>
+        </w:tc>
+        <w:tc>
+          <w:tcPr>
+            <w:tcW w:type="dxa" w:w="6747"/>
+            <w:tcMar>
+              <w:top w:type="dxa" w:w="60"/>
+              <w:left w:type="dxa" w:w="100"/>
+              <w:bottom w:type="dxa" w:w="60"/>
+              <w:right w:type="dxa" w:w="100"/>
+            </w:tcMar>
+          </w:tcPr>
+          <w:p>
+            <w:r>
+              <w:t xml:space="preserve">to work in a company for a limited period, usually as a student, in order to gain experience.</w:t>
+            </w:r>
+          </w:p>
+        </w:tc>
+      </w:tr>
+      <w:tr>
+        <w:tc>
+          <w:tcPr>
+            <w:tcW w:type="dxa" w:w="2891"/>
+            <w:tcMar>
+              <w:top w:type="dxa" w:w="60"/>
+              <w:left w:type="dxa" w:w="100"/>
+              <w:bottom w:type="dxa" w:w="60"/>
+              <w:right w:type="dxa" w:w="100"/>
+            </w:tcMar>
+          </w:tcPr>
+          <w:p>
+            <w:r>
+              <w:rPr>
+                <w:b/>
+                <w:bCs/>
+              </w:rPr>
+              <w:t xml:space="preserve">skills</w:t>
+            </w:r>
+          </w:p>
+        </w:tc>
+        <w:tc>
+          <w:tcPr>
+            <w:tcW w:type="dxa" w:w="6747"/>
+            <w:tcMar>
+              <w:top w:type="dxa" w:w="60"/>
+              <w:left w:type="dxa" w:w="100"/>
+              <w:bottom w:type="dxa" w:w="60"/>
+              <w:right w:type="dxa" w:w="100"/>
+            </w:tcMar>
+          </w:tcPr>
+          <w:p>
+            <w:r>
+              <w:t xml:space="preserve">abilities to do something well, which are learnt through training or experience.</w:t>
+            </w:r>
+          </w:p>
+        </w:tc>
+      </w:tr>
+      <w:tr>
+        <w:tc>
+          <w:tcPr>
+            <w:tcW w:type="dxa" w:w="2891"/>
+            <w:tcMar>
+              <w:top w:type="dxa" w:w="60"/>
+              <w:left w:type="dxa" w:w="100"/>
+              <w:bottom w:type="dxa" w:w="60"/>
+              <w:right w:type="dxa" w:w="100"/>
+            </w:tcMar>
+          </w:tcPr>
+          <w:p>
+            <w:r>
+              <w:rPr>
+                <w:b/>
+                <w:bCs/>
+              </w:rPr>
+              <w:t xml:space="preserve">valuable</w:t>
+            </w:r>
+          </w:p>
+        </w:tc>
+        <w:tc>
+          <w:tcPr>
+            <w:tcW w:type="dxa" w:w="6747"/>
+            <w:tcMar>
+              <w:top w:type="dxa" w:w="60"/>
+              <w:left w:type="dxa" w:w="100"/>
+              <w:bottom w:type="dxa" w:w="60"/>
+              <w:right w:type="dxa" w:w="100"/>
+            </w:tcMar>
+          </w:tcPr>
+          <w:p>
+            <w:r>
+              <w:t xml:space="preserve">describes something that is very useful or important.</w:t>
+            </w:r>
+          </w:p>
+        </w:tc>
+      </w:tr>
+      <w:tr>
+        <w:tc>
+          <w:tcPr>
+            <w:tcW w:type="dxa" w:w="2891"/>
+            <w:tcMar>
+              <w:top w:type="dxa" w:w="60"/>
+              <w:left w:type="dxa" w:w="100"/>
+              <w:bottom w:type="dxa" w:w="60"/>
+              <w:right w:type="dxa" w:w="100"/>
+            </w:tcMar>
+          </w:tcPr>
+          <w:p>
+            <w:r>
+              <w:rPr>
+                <w:b/>
+                <w:bCs/>
+              </w:rPr>
+              <w:t xml:space="preserve">critically</w:t>
+            </w:r>
+          </w:p>
+        </w:tc>
+        <w:tc>
+          <w:tcPr>
+            <w:tcW w:type="dxa" w:w="6747"/>
+            <w:tcMar>
+              <w:top w:type="dxa" w:w="60"/>
+              <w:left w:type="dxa" w:w="100"/>
+              <w:bottom w:type="dxa" w:w="60"/>
+              <w:right w:type="dxa" w:w="100"/>
+            </w:tcMar>
+          </w:tcPr>
+          <w:p>
+            <w:r>
+              <w:t xml:space="preserve">(adverb) in a careful way that analyses and evaluates information before accepting it, e.g. to think critically.</w:t>
+            </w:r>
+          </w:p>
+        </w:tc>
+      </w:tr>
+      <w:tr>
+        <w:tc>
+          <w:tcPr>
+            <w:tcW w:type="dxa" w:w="2891"/>
+            <w:tcMar>
+              <w:top w:type="dxa" w:w="60"/>
+              <w:left w:type="dxa" w:w="100"/>
+              <w:bottom w:type="dxa" w:w="60"/>
+              <w:right w:type="dxa" w:w="100"/>
+            </w:tcMar>
+          </w:tcPr>
+          <w:p>
+            <w:r>
+              <w:rPr>
+                <w:b/>
+                <w:bCs/>
+              </w:rPr>
+              <w:t xml:space="preserve">growth</w:t>
+            </w:r>
+          </w:p>
+        </w:tc>
+        <w:tc>
+          <w:tcPr>
+            <w:tcW w:type="dxa" w:w="6747"/>
+            <w:tcMar>
+              <w:top w:type="dxa" w:w="60"/>
+              <w:left w:type="dxa" w:w="100"/>
+              <w:bottom w:type="dxa" w:w="60"/>
+              <w:right w:type="dxa" w:w="100"/>
+            </w:tcMar>
+          </w:tcPr>
+          <w:p>
+            <w:r>
+              <w:t xml:space="preserve">the increase in the size, value or success of something, e.g. a company's growth.</w:t>
+            </w:r>
+          </w:p>
+        </w:tc>
+      </w:tr>
+      <w:tr>
+        <w:tc>
+          <w:tcPr>
+            <w:tcW w:type="dxa" w:w="2891"/>
+            <w:tcMar>
+              <w:top w:type="dxa" w:w="60"/>
+              <w:left w:type="dxa" w:w="100"/>
+              <w:bottom w:type="dxa" w:w="60"/>
+              <w:right w:type="dxa" w:w="100"/>
+            </w:tcMar>
+          </w:tcPr>
+          <w:p>
+            <w:r>
+              <w:rPr>
+                <w:b/>
+                <w:bCs/>
+              </w:rPr>
+              <w:t xml:space="preserve">thrilled</w:t>
+            </w:r>
+          </w:p>
+        </w:tc>
+        <w:tc>
+          <w:tcPr>
+            <w:tcW w:type="dxa" w:w="6747"/>
+            <w:tcMar>
+              <w:top w:type="dxa" w:w="60"/>
+              <w:left w:type="dxa" w:w="100"/>
+              <w:bottom w:type="dxa" w:w="60"/>
+              <w:right w:type="dxa" w:w="100"/>
+            </w:tcMar>
+          </w:tcPr>
+          <w:p>
+            <w:r>
+              <w:t xml:space="preserve">describes a person who is extremely happy and excited about something.</w:t>
+            </w:r>
+          </w:p>
+        </w:tc>
+      </w:tr>
+    </w:tbl>
+    <w:p>
+      <w:pPr>
+        <w:pBdr>
+          <w:left w:val="single" w:color="BF9000" w:sz="18" w:space="6"/>
+        </w:pBdr>
+        <w:shd w:fill="FFF2CC" w:color="auto" w:val="clear"/>
+        <w:spacing w:after="120" w:before="80"/>
+      </w:pPr>
+      <w:r>
+        <w:t xml:space="preserve">⚠️ </w:t>
+      </w:r>
+      <w:r>
+        <w:rPr>
+          <w:b/>
+          <w:bCs/>
+        </w:rPr>
+        <w:t xml:space="preserve">Faux ami :</w:t>
+      </w:r>
+      <w:r>
+        <w:t xml:space="preserve"> </w:t>
+      </w:r>
+      <w:r>
+        <w:rPr>
+          <w:i/>
+          <w:iCs/>
+        </w:rPr>
+        <w:t xml:space="preserve">comprehensive</w:t>
+      </w:r>
+      <w:r>
+        <w:t xml:space="preserve"> signifie « complet », et non « compréhensif » (qui se dit </w:t>
+      </w:r>
+      <w:r>
+        <w:rPr>
+          <w:i/>
+          <w:iCs/>
+        </w:rPr>
+        <w:t xml:space="preserve">understanding</w:t>
+      </w:r>
+      <w:r>
+        <w:t xml:space="preserve">).</w:t>
+      </w:r>
+    </w:p>
     <w:p>
       <w:pPr>
         <w:pStyle w:val="Heading1"/>
@@ -6191,6 +6962,312 @@
                 <w:iCs/>
               </w:rPr>
               <w:t xml:space="preserve">I am in charge of [TÂCHE] at [ENTREPRISE], which requires accuracy and reliability.</w:t>
+            </w:r>
+          </w:p>
+        </w:tc>
+      </w:tr>
+    </w:tbl>
+    <w:p>
+      <w:pPr>
+        <w:spacing w:after="100"/>
+      </w:pPr>
+      <w:r>
+        <w:rPr>
+          <w:b/>
+          <w:bCs/>
+        </w:rPr>
+        <w:t xml:space="preserve">Les formules du post de Maria, à réutiliser :</w:t>
+      </w:r>
+    </w:p>
+    <w:tbl>
+      <w:tblPr>
+        <w:tblW w:type="dxa" w:w="9638"/>
+        <w:tblBorders>
+          <w:top w:val="single" w:color="auto" w:sz="4"/>
+          <w:left w:val="single" w:color="auto" w:sz="4"/>
+          <w:bottom w:val="single" w:color="auto" w:sz="4"/>
+          <w:right w:val="single" w:color="auto" w:sz="4"/>
+          <w:insideH w:val="single" w:color="auto" w:sz="4"/>
+          <w:insideV w:val="single" w:color="auto" w:sz="4"/>
+        </w:tblBorders>
+      </w:tblPr>
+      <w:tblGrid>
+        <w:gridCol w:w="5783"/>
+        <w:gridCol w:w="3855"/>
+      </w:tblGrid>
+      <w:tr>
+        <w:trPr>
+          <w:tblHeader/>
+        </w:trPr>
+        <w:tc>
+          <w:tcPr>
+            <w:tcW w:type="dxa" w:w="5783"/>
+            <w:shd w:fill="1F4E79" w:color="auto" w:val="clear"/>
+            <w:tcMar>
+              <w:top w:type="dxa" w:w="60"/>
+              <w:left w:type="dxa" w:w="100"/>
+              <w:bottom w:type="dxa" w:w="60"/>
+              <w:right w:type="dxa" w:w="100"/>
+            </w:tcMar>
+          </w:tcPr>
+          <w:p>
+            <w:r>
+              <w:rPr>
+                <w:b/>
+                <w:bCs/>
+                <w:color w:val="FFFFFF"/>
+              </w:rPr>
+              <w:t xml:space="preserve">Formule</w:t>
+            </w:r>
+          </w:p>
+        </w:tc>
+        <w:tc>
+          <w:tcPr>
+            <w:tcW w:type="dxa" w:w="3855"/>
+            <w:shd w:fill="1F4E79" w:color="auto" w:val="clear"/>
+            <w:tcMar>
+              <w:top w:type="dxa" w:w="60"/>
+              <w:left w:type="dxa" w:w="100"/>
+              <w:bottom w:type="dxa" w:w="60"/>
+              <w:right w:type="dxa" w:w="100"/>
+            </w:tcMar>
+          </w:tcPr>
+          <w:p>
+            <w:r>
+              <w:rPr>
+                <w:b/>
+                <w:bCs/>
+                <w:color w:val="FFFFFF"/>
+              </w:rPr>
+              <w:t xml:space="preserve">Usage</w:t>
+            </w:r>
+          </w:p>
+        </w:tc>
+      </w:tr>
+      <w:tr>
+        <w:tc>
+          <w:tcPr>
+            <w:tcW w:type="dxa" w:w="5783"/>
+            <w:tcMar>
+              <w:top w:type="dxa" w:w="60"/>
+              <w:left w:type="dxa" w:w="100"/>
+              <w:bottom w:type="dxa" w:w="60"/>
+              <w:right w:type="dxa" w:w="100"/>
+            </w:tcMar>
+          </w:tcPr>
+          <w:p>
+            <w:r>
+              <w:rPr>
+                <w:i/>
+                <w:iCs/>
+              </w:rPr>
+              <w:t xml:space="preserve">I have consistently demonstrated my commitment to…</w:t>
+            </w:r>
+          </w:p>
+        </w:tc>
+        <w:tc>
+          <w:tcPr>
+            <w:tcW w:type="dxa" w:w="3855"/>
+            <w:tcMar>
+              <w:top w:type="dxa" w:w="60"/>
+              <w:left w:type="dxa" w:w="100"/>
+              <w:bottom w:type="dxa" w:w="60"/>
+              <w:right w:type="dxa" w:w="100"/>
+            </w:tcMar>
+          </w:tcPr>
+          <w:p>
+            <w:r>
+              <w:t xml:space="preserve">Present perfect : une qualité montrée sans date précise</w:t>
+            </w:r>
+          </w:p>
+        </w:tc>
+      </w:tr>
+      <w:tr>
+        <w:tc>
+          <w:tcPr>
+            <w:tcW w:type="dxa" w:w="5783"/>
+            <w:tcMar>
+              <w:top w:type="dxa" w:w="60"/>
+              <w:left w:type="dxa" w:w="100"/>
+              <w:bottom w:type="dxa" w:w="60"/>
+              <w:right w:type="dxa" w:w="100"/>
+            </w:tcMar>
+          </w:tcPr>
+          <w:p>
+            <w:r>
+              <w:rPr>
+                <w:i/>
+                <w:iCs/>
+              </w:rPr>
+              <w:t xml:space="preserve">…where I gained practical experience in…</w:t>
+            </w:r>
+          </w:p>
+        </w:tc>
+        <w:tc>
+          <w:tcPr>
+            <w:tcW w:type="dxa" w:w="3855"/>
+            <w:tcMar>
+              <w:top w:type="dxa" w:w="60"/>
+              <w:left w:type="dxa" w:w="100"/>
+              <w:bottom w:type="dxa" w:w="60"/>
+              <w:right w:type="dxa" w:w="100"/>
+            </w:tcMar>
+          </w:tcPr>
+          <w:p>
+            <w:r>
+              <w:t xml:space="preserve">Past simple : une expérience terminée</w:t>
+            </w:r>
+          </w:p>
+        </w:tc>
+      </w:tr>
+      <w:tr>
+        <w:tc>
+          <w:tcPr>
+            <w:tcW w:type="dxa" w:w="5783"/>
+            <w:tcMar>
+              <w:top w:type="dxa" w:w="60"/>
+              <w:left w:type="dxa" w:w="100"/>
+              <w:bottom w:type="dxa" w:w="60"/>
+              <w:right w:type="dxa" w:w="100"/>
+            </w:tcMar>
+          </w:tcPr>
+          <w:p>
+            <w:r>
+              <w:rPr>
+                <w:i/>
+                <w:iCs/>
+              </w:rPr>
+              <w:t xml:space="preserve">This experience honed my analytical skills.</w:t>
+            </w:r>
+          </w:p>
+        </w:tc>
+        <w:tc>
+          <w:tcPr>
+            <w:tcW w:type="dxa" w:w="3855"/>
+            <w:tcMar>
+              <w:top w:type="dxa" w:w="60"/>
+              <w:left w:type="dxa" w:w="100"/>
+              <w:bottom w:type="dxa" w:w="60"/>
+              <w:right w:type="dxa" w:w="100"/>
+            </w:tcMar>
+          </w:tcPr>
+          <w:p>
+            <w:r>
+              <w:t xml:space="preserve">Une preuve concrète d'une compétence (§3, « Why you »)</w:t>
+            </w:r>
+          </w:p>
+        </w:tc>
+      </w:tr>
+      <w:tr>
+        <w:tc>
+          <w:tcPr>
+            <w:tcW w:type="dxa" w:w="5783"/>
+            <w:tcMar>
+              <w:top w:type="dxa" w:w="60"/>
+              <w:left w:type="dxa" w:w="100"/>
+              <w:bottom w:type="dxa" w:w="60"/>
+              <w:right w:type="dxa" w:w="100"/>
+            </w:tcMar>
+          </w:tcPr>
+          <w:p>
+            <w:r>
+              <w:rPr>
+                <w:i/>
+                <w:iCs/>
+              </w:rPr>
+              <w:t xml:space="preserve">I am eager to apply these skills in…</w:t>
+            </w:r>
+          </w:p>
+        </w:tc>
+        <w:tc>
+          <w:tcPr>
+            <w:tcW w:type="dxa" w:w="3855"/>
+            <w:tcMar>
+              <w:top w:type="dxa" w:w="60"/>
+              <w:left w:type="dxa" w:w="100"/>
+              <w:bottom w:type="dxa" w:w="60"/>
+              <w:right w:type="dxa" w:w="100"/>
+            </w:tcMar>
+          </w:tcPr>
+          <w:p>
+            <w:r>
+              <w:t xml:space="preserve">Exprimer sa motivation (§2)</w:t>
+            </w:r>
+          </w:p>
+        </w:tc>
+      </w:tr>
+      <w:tr>
+        <w:tc>
+          <w:tcPr>
+            <w:tcW w:type="dxa" w:w="5783"/>
+            <w:tcMar>
+              <w:top w:type="dxa" w:w="60"/>
+              <w:left w:type="dxa" w:w="100"/>
+              <w:bottom w:type="dxa" w:w="60"/>
+              <w:right w:type="dxa" w:w="100"/>
+            </w:tcMar>
+          </w:tcPr>
+          <w:p>
+            <w:r>
+              <w:rPr>
+                <w:i/>
+                <w:iCs/>
+              </w:rPr>
+              <w:t xml:space="preserve">I would be thrilled to discuss how I can contribute.</w:t>
+            </w:r>
+          </w:p>
+        </w:tc>
+        <w:tc>
+          <w:tcPr>
+            <w:tcW w:type="dxa" w:w="3855"/>
+            <w:tcMar>
+              <w:top w:type="dxa" w:w="60"/>
+              <w:left w:type="dxa" w:w="100"/>
+              <w:bottom w:type="dxa" w:w="60"/>
+              <w:right w:type="dxa" w:w="100"/>
+            </w:tcMar>
+          </w:tcPr>
+          <w:p>
+            <w:r>
+              <w:t xml:space="preserve">Le conditionnel « je serais » (§4)</w:t>
+            </w:r>
+          </w:p>
+        </w:tc>
+      </w:tr>
+      <w:tr>
+        <w:tc>
+          <w:tcPr>
+            <w:tcW w:type="dxa" w:w="5783"/>
+            <w:tcMar>
+              <w:top w:type="dxa" w:w="60"/>
+              <w:left w:type="dxa" w:w="100"/>
+              <w:bottom w:type="dxa" w:w="60"/>
+              <w:right w:type="dxa" w:w="100"/>
+            </w:tcMar>
+          </w:tcPr>
+          <w:p>
+            <w:r>
+              <w:rPr>
+                <w:i/>
+                <w:iCs/>
+              </w:rPr>
+              <w:t xml:space="preserve">Best regards,</w:t>
+            </w:r>
+          </w:p>
+        </w:tc>
+        <w:tc>
+          <w:tcPr>
+            <w:tcW w:type="dxa" w:w="3855"/>
+            <w:tcMar>
+              <w:top w:type="dxa" w:w="60"/>
+              <w:left w:type="dxa" w:w="100"/>
+              <w:bottom w:type="dxa" w:w="60"/>
+              <w:right w:type="dxa" w:w="100"/>
+            </w:tcMar>
+          </w:tcPr>
+          <w:p>
+            <w:r>
+              <w:t xml:space="preserve">La clôture d'un e-mail : confirme tes notes de TD</w:t>
             </w:r>
           </w:p>
         </w:tc>

</xml_diff>